<commit_message>
add student and faculty metadata header to all lab manuals
</commit_message>
<xml_diff>
--- a/Lab Manual Docs/Exp_01_Project_Selection_and_Conceptualization.docx
+++ b/Lab Manual Docs/Exp_01_Project_Selection_and_Conceptualization.docx
@@ -2,6 +2,352 @@
 <file path=word/document.xml><?xml version="1.0" encoding="utf-8"?>
 <w:document xmlns:wpc="http://schemas.microsoft.com/office/word/2010/wordprocessingCanvas" xmlns:mo="http://schemas.microsoft.com/office/mac/office/2008/main" xmlns:mc="http://schemas.openxmlformats.org/markup-compatibility/2006" xmlns:mv="urn:schemas-microsoft-com:mac:vml" xmlns:o="urn:schemas-microsoft-com:office:office" xmlns:r="http://schemas.openxmlformats.org/officeDocument/2006/relationships" xmlns:m="http://schemas.openxmlformats.org/officeDocument/2006/math" xmlns:v="urn:schemas-microsoft-com:vml" xmlns:wp14="http://schemas.microsoft.com/office/word/2010/wordprocessingDrawing" xmlns:wp="http://schemas.openxmlformats.org/drawingml/2006/wordprocessingDrawing" xmlns:w10="urn:schemas-microsoft-com:office:word" xmlns:w="http://schemas.openxmlformats.org/wordprocessingml/2006/main" xmlns:w14="http://schemas.microsoft.com/office/word/2010/wordml" xmlns:wpg="http://schemas.microsoft.com/office/word/2010/wordprocessingGroup" xmlns:wpi="http://schemas.microsoft.com/office/word/2010/wordprocessingInk" xmlns:wne="http://schemas.microsoft.com/office/word/2006/wordml" xmlns:wps="http://schemas.microsoft.com/office/word/2010/wordprocessingShape" mc:Ignorable="w14 wp14">
   <w:body>
+    <w:tbl>
+      <w:tblPr>
+        <w:tblW w:type="auto" w:w="0"/>
+        <w:jc w:val="center"/>
+        <w:tblLook w:firstColumn="1" w:firstRow="1" w:lastColumn="0" w:lastRow="0" w:noHBand="0" w:noVBand="1" w:val="04A0"/>
+        <w:tblBorders>
+          <w:top w:val="single" w:sz="8" w:space="0" w:color="000000"/>
+          <w:left w:val="single" w:sz="8" w:space="0" w:color="000000"/>
+          <w:bottom w:val="single" w:sz="8" w:space="0" w:color="000000"/>
+          <w:right w:val="single" w:sz="8" w:space="0" w:color="000000"/>
+          <w:insideH w:val="single" w:sz="8" w:space="0" w:color="000000"/>
+          <w:insideV w:val="single" w:sz="8" w:space="0" w:color="000000"/>
+        </w:tblBorders>
+      </w:tblPr>
+      <w:tblGrid>
+        <w:gridCol w:w="4320"/>
+        <w:gridCol w:w="4320"/>
+      </w:tblGrid>
+      <w:tr>
+        <w:tc>
+          <w:tcPr>
+            <w:tcW w:type="dxa" w:w="2592"/>
+            <w:tcMar>
+              <w:top w:w="100" w:type="dxa"/>
+              <w:bottom w:w="100" w:type="dxa"/>
+              <w:left w:w="140" w:type="dxa"/>
+              <w:right w:w="140" w:type="dxa"/>
+            </w:tcMar>
+          </w:tcPr>
+          <w:p>
+            <w:pPr>
+              <w:spacing w:before="0" w:after="0" w:line="276" w:lineRule="auto"/>
+              <w:jc w:val="left"/>
+            </w:pPr>
+            <w:r>
+              <w:rPr>
+                <w:rFonts w:ascii="Calibri" w:hAnsi="Calibri"/>
+                <w:b/>
+                <w:color w:val="000000"/>
+                <w:sz w:val="21"/>
+              </w:rPr>
+              <w:t>NAME</w:t>
+            </w:r>
+          </w:p>
+        </w:tc>
+        <w:tc>
+          <w:tcPr>
+            <w:tcW w:type="dxa" w:w="6768"/>
+            <w:tcMar>
+              <w:top w:w="100" w:type="dxa"/>
+              <w:bottom w:w="100" w:type="dxa"/>
+              <w:left w:w="140" w:type="dxa"/>
+              <w:right w:w="140" w:type="dxa"/>
+            </w:tcMar>
+          </w:tcPr>
+          <w:p>
+            <w:pPr>
+              <w:spacing w:before="0" w:after="0" w:line="276" w:lineRule="auto"/>
+              <w:jc w:val="left"/>
+            </w:pPr>
+            <w:r>
+              <w:rPr>
+                <w:rFonts w:ascii="Calibri" w:hAnsi="Calibri"/>
+                <w:color w:val="000000"/>
+                <w:sz w:val="21"/>
+              </w:rPr>
+              <w:t>Kimaya Teli</w:t>
+              <w:br/>
+              <w:t>Abhishek kumar Kairamkonda</w:t>
+              <w:br/>
+              <w:t>Krishna Somani</w:t>
+            </w:r>
+          </w:p>
+        </w:tc>
+      </w:tr>
+      <w:tr>
+        <w:tc>
+          <w:tcPr>
+            <w:tcW w:type="dxa" w:w="2592"/>
+            <w:tcMar>
+              <w:top w:w="100" w:type="dxa"/>
+              <w:bottom w:w="100" w:type="dxa"/>
+              <w:left w:w="140" w:type="dxa"/>
+              <w:right w:w="140" w:type="dxa"/>
+            </w:tcMar>
+          </w:tcPr>
+          <w:p>
+            <w:pPr>
+              <w:spacing w:before="0" w:after="0" w:line="276" w:lineRule="auto"/>
+              <w:jc w:val="left"/>
+            </w:pPr>
+            <w:r>
+              <w:rPr>
+                <w:rFonts w:ascii="Calibri" w:hAnsi="Calibri"/>
+                <w:b/>
+                <w:color w:val="000000"/>
+                <w:sz w:val="21"/>
+              </w:rPr>
+              <w:t>ROLL NO</w:t>
+            </w:r>
+          </w:p>
+        </w:tc>
+        <w:tc>
+          <w:tcPr>
+            <w:tcW w:type="dxa" w:w="6768"/>
+            <w:tcMar>
+              <w:top w:w="100" w:type="dxa"/>
+              <w:bottom w:w="100" w:type="dxa"/>
+              <w:left w:w="140" w:type="dxa"/>
+              <w:right w:w="140" w:type="dxa"/>
+            </w:tcMar>
+          </w:tcPr>
+          <w:p>
+            <w:pPr>
+              <w:spacing w:before="0" w:after="0" w:line="276" w:lineRule="auto"/>
+              <w:jc w:val="left"/>
+            </w:pPr>
+            <w:r>
+              <w:rPr>
+                <w:rFonts w:ascii="Calibri" w:hAnsi="Calibri"/>
+                <w:color w:val="000000"/>
+                <w:sz w:val="21"/>
+              </w:rPr>
+              <w:t>24102C0079</w:t>
+              <w:br/>
+              <w:t>24102C0085</w:t>
+              <w:br/>
+              <w:t>24102C0067</w:t>
+            </w:r>
+          </w:p>
+        </w:tc>
+      </w:tr>
+      <w:tr>
+        <w:tc>
+          <w:tcPr>
+            <w:tcW w:type="dxa" w:w="2592"/>
+            <w:tcMar>
+              <w:top w:w="100" w:type="dxa"/>
+              <w:bottom w:w="100" w:type="dxa"/>
+              <w:left w:w="140" w:type="dxa"/>
+              <w:right w:w="140" w:type="dxa"/>
+            </w:tcMar>
+          </w:tcPr>
+          <w:p>
+            <w:pPr>
+              <w:spacing w:before="0" w:after="0" w:line="276" w:lineRule="auto"/>
+              <w:jc w:val="left"/>
+            </w:pPr>
+            <w:r>
+              <w:rPr>
+                <w:rFonts w:ascii="Calibri" w:hAnsi="Calibri"/>
+                <w:b/>
+                <w:color w:val="000000"/>
+                <w:sz w:val="21"/>
+              </w:rPr>
+              <w:t>BRANCH</w:t>
+            </w:r>
+          </w:p>
+        </w:tc>
+        <w:tc>
+          <w:tcPr>
+            <w:tcW w:type="dxa" w:w="6768"/>
+            <w:tcMar>
+              <w:top w:w="100" w:type="dxa"/>
+              <w:bottom w:w="100" w:type="dxa"/>
+              <w:left w:w="140" w:type="dxa"/>
+              <w:right w:w="140" w:type="dxa"/>
+            </w:tcMar>
+          </w:tcPr>
+          <w:p>
+            <w:pPr>
+              <w:spacing w:before="0" w:after="0" w:line="276" w:lineRule="auto"/>
+              <w:jc w:val="left"/>
+            </w:pPr>
+            <w:r>
+              <w:rPr>
+                <w:rFonts w:ascii="Calibri" w:hAnsi="Calibri"/>
+                <w:color w:val="000000"/>
+                <w:sz w:val="21"/>
+              </w:rPr>
+              <w:t>CMPN</w:t>
+            </w:r>
+          </w:p>
+        </w:tc>
+      </w:tr>
+      <w:tr>
+        <w:tc>
+          <w:tcPr>
+            <w:tcW w:type="dxa" w:w="2592"/>
+            <w:tcMar>
+              <w:top w:w="100" w:type="dxa"/>
+              <w:bottom w:w="100" w:type="dxa"/>
+              <w:left w:w="140" w:type="dxa"/>
+              <w:right w:w="140" w:type="dxa"/>
+            </w:tcMar>
+          </w:tcPr>
+          <w:p>
+            <w:pPr>
+              <w:spacing w:before="0" w:after="0" w:line="276" w:lineRule="auto"/>
+              <w:jc w:val="left"/>
+            </w:pPr>
+            <w:r>
+              <w:rPr>
+                <w:rFonts w:ascii="Calibri" w:hAnsi="Calibri"/>
+                <w:b/>
+                <w:color w:val="000000"/>
+                <w:sz w:val="21"/>
+              </w:rPr>
+              <w:t>DIV</w:t>
+            </w:r>
+          </w:p>
+        </w:tc>
+        <w:tc>
+          <w:tcPr>
+            <w:tcW w:type="dxa" w:w="6768"/>
+            <w:tcMar>
+              <w:top w:w="100" w:type="dxa"/>
+              <w:bottom w:w="100" w:type="dxa"/>
+              <w:left w:w="140" w:type="dxa"/>
+              <w:right w:w="140" w:type="dxa"/>
+            </w:tcMar>
+          </w:tcPr>
+          <w:p>
+            <w:pPr>
+              <w:spacing w:before="0" w:after="0" w:line="276" w:lineRule="auto"/>
+              <w:jc w:val="left"/>
+            </w:pPr>
+            <w:r>
+              <w:rPr>
+                <w:rFonts w:ascii="Calibri" w:hAnsi="Calibri"/>
+                <w:color w:val="000000"/>
+                <w:sz w:val="21"/>
+              </w:rPr>
+              <w:t>C</w:t>
+            </w:r>
+          </w:p>
+        </w:tc>
+      </w:tr>
+      <w:tr>
+        <w:tc>
+          <w:tcPr>
+            <w:tcW w:type="dxa" w:w="2592"/>
+            <w:tcMar>
+              <w:top w:w="100" w:type="dxa"/>
+              <w:bottom w:w="100" w:type="dxa"/>
+              <w:left w:w="140" w:type="dxa"/>
+              <w:right w:w="140" w:type="dxa"/>
+            </w:tcMar>
+          </w:tcPr>
+          <w:p>
+            <w:pPr>
+              <w:spacing w:before="0" w:after="0" w:line="276" w:lineRule="auto"/>
+              <w:jc w:val="left"/>
+            </w:pPr>
+            <w:r>
+              <w:rPr>
+                <w:rFonts w:ascii="Calibri" w:hAnsi="Calibri"/>
+                <w:b/>
+                <w:color w:val="000000"/>
+                <w:sz w:val="21"/>
+              </w:rPr>
+              <w:t>SUBJECT</w:t>
+            </w:r>
+          </w:p>
+        </w:tc>
+        <w:tc>
+          <w:tcPr>
+            <w:tcW w:type="dxa" w:w="6768"/>
+            <w:tcMar>
+              <w:top w:w="100" w:type="dxa"/>
+              <w:bottom w:w="100" w:type="dxa"/>
+              <w:left w:w="140" w:type="dxa"/>
+              <w:right w:w="140" w:type="dxa"/>
+            </w:tcMar>
+          </w:tcPr>
+          <w:p>
+            <w:pPr>
+              <w:spacing w:before="0" w:after="0" w:line="276" w:lineRule="auto"/>
+              <w:jc w:val="left"/>
+            </w:pPr>
+            <w:r>
+              <w:rPr>
+                <w:rFonts w:ascii="Calibri" w:hAnsi="Calibri"/>
+                <w:color w:val="000000"/>
+                <w:sz w:val="21"/>
+              </w:rPr>
+              <w:t>WDL LAB</w:t>
+            </w:r>
+          </w:p>
+        </w:tc>
+      </w:tr>
+      <w:tr>
+        <w:tc>
+          <w:tcPr>
+            <w:tcW w:type="dxa" w:w="2592"/>
+            <w:tcMar>
+              <w:top w:w="100" w:type="dxa"/>
+              <w:bottom w:w="100" w:type="dxa"/>
+              <w:left w:w="140" w:type="dxa"/>
+              <w:right w:w="140" w:type="dxa"/>
+            </w:tcMar>
+          </w:tcPr>
+          <w:p>
+            <w:pPr>
+              <w:spacing w:before="0" w:after="0" w:line="276" w:lineRule="auto"/>
+              <w:jc w:val="left"/>
+            </w:pPr>
+            <w:r>
+              <w:rPr>
+                <w:rFonts w:ascii="Calibri" w:hAnsi="Calibri"/>
+                <w:b/>
+                <w:color w:val="000000"/>
+                <w:sz w:val="21"/>
+              </w:rPr>
+              <w:t>FACULTY</w:t>
+            </w:r>
+          </w:p>
+        </w:tc>
+        <w:tc>
+          <w:tcPr>
+            <w:tcW w:type="dxa" w:w="6768"/>
+            <w:tcMar>
+              <w:top w:w="100" w:type="dxa"/>
+              <w:bottom w:w="100" w:type="dxa"/>
+              <w:left w:w="140" w:type="dxa"/>
+              <w:right w:w="140" w:type="dxa"/>
+            </w:tcMar>
+          </w:tcPr>
+          <w:p>
+            <w:pPr>
+              <w:spacing w:before="0" w:after="0" w:line="276" w:lineRule="auto"/>
+              <w:jc w:val="left"/>
+            </w:pPr>
+            <w:r>
+              <w:rPr>
+                <w:rFonts w:ascii="Calibri" w:hAnsi="Calibri"/>
+                <w:color w:val="000000"/>
+                <w:sz w:val="21"/>
+              </w:rPr>
+              <w:t>Dr. Ravindra Sangle</w:t>
+            </w:r>
+          </w:p>
+        </w:tc>
+      </w:tr>
+    </w:tbl>
+    <w:p/>
     <w:p>
       <w:pPr>
         <w:jc w:val="center"/>

</xml_diff>

<commit_message>
upgrade all 13 lab manual documents to comprehensive professional format with viva questions
</commit_message>
<xml_diff>
--- a/Lab Manual Docs/Exp_01_Project_Selection_and_Conceptualization.docx
+++ b/Lab Manual Docs/Exp_01_Project_Selection_and_Conceptualization.docx
@@ -17,8 +17,8 @@
         </w:tblBorders>
       </w:tblPr>
       <w:tblGrid>
-        <w:gridCol w:w="4320"/>
-        <w:gridCol w:w="4320"/>
+        <w:gridCol w:w="4680"/>
+        <w:gridCol w:w="4680"/>
       </w:tblGrid>
       <w:tr>
         <w:tc>
@@ -356,7 +356,7 @@
         <w:rPr>
           <w:rFonts w:ascii="Calibri" w:hAnsi="Calibri"/>
           <w:b/>
-          <w:color w:val="555555"/>
+          <w:color w:val="444444"/>
           <w:sz w:val="26"/>
         </w:rPr>
         <w:t>SOFTWARE ENGINEERING &amp; WEB DEVELOPMENT LAB MANUAL</w:t>
@@ -370,7 +370,7 @@
         <w:rPr>
           <w:rFonts w:ascii="Calibri" w:hAnsi="Calibri"/>
           <w:i/>
-          <w:color w:val="7F8C8D"/>
+          <w:color w:val="666666"/>
           <w:sz w:val="20"/>
         </w:rPr>
         <w:t>PROJECT CASE STUDY: LEDGERLY — INVOICE &amp; QUOTATION GENERATOR PWA</w:t>
@@ -379,6 +379,7 @@
     <w:p>
       <w:pPr>
         <w:pStyle w:val="Heading1"/>
+        <w:spacing w:before="280" w:after="80"/>
         <w:jc w:val="left"/>
       </w:pPr>
       <w:r>
@@ -386,7 +387,7 @@
           <w:rFonts w:ascii="Calibri" w:hAnsi="Calibri"/>
           <w:b/>
           <w:color w:val="1B4D4B"/>
-          <w:sz w:val="32"/>
+          <w:sz w:val="30"/>
         </w:rPr>
         <w:t>Experiment No. 1: Project Selection and Conceptualization</w:t>
       </w:r>
@@ -395,235 +396,243 @@
     <w:p>
       <w:pPr>
         <w:pStyle w:val="Heading2"/>
+        <w:spacing w:before="200" w:after="60"/>
       </w:pPr>
       <w:r>
         <w:rPr>
           <w:rFonts w:ascii="Calibri" w:hAnsi="Calibri"/>
           <w:b/>
           <w:color w:val="2C3E50"/>
-          <w:sz w:val="26"/>
+          <w:sz w:val="25"/>
         </w:rPr>
-        <w:t>1. Pre-Requisites</w:t>
+        <w:t>1. Aim &amp; Objectives</w:t>
       </w:r>
     </w:p>
     <w:p>
+      <w:pPr>
+        <w:spacing w:before="0" w:after="90" w:line="276" w:lineRule="auto"/>
+      </w:pPr>
       <w:r>
-        <w:t>• Basic knowledge of the Software Development Life Cycle (SDLC) &amp; Agile principles.</w:t>
-        <w:br/>
-        <w:t>• Understanding of small business accounting, billing lifecycles, and user needs.</w:t>
-        <w:br/>
-        <w:t>• Fundamentals of requirement gathering and stakeholder boundary definition.</w:t>
-        <w:br/>
-        <w:t>• Awareness of modern web standards, browser persistence, and offline web apps.</w:t>
+        <w:rPr>
+          <w:rFonts w:ascii="Calibri" w:hAnsi="Calibri"/>
+          <w:color w:val="1A202C"/>
+          <w:sz w:val="21"/>
+        </w:rPr>
+        <w:t>The primary aim of this experiment is to conceptualize, define, and evaluate the architectural scope of an enterprise-grade web application tailored to small business financial workflows.</w:t>
+      </w:r>
+    </w:p>
+    <w:p>
+      <w:pPr>
+        <w:spacing w:before="0" w:after="90" w:line="276" w:lineRule="auto"/>
+      </w:pPr>
+      <w:r>
+        <w:rPr>
+          <w:rFonts w:ascii="Calibri" w:hAnsi="Calibri"/>
+          <w:color w:val="1A202C"/>
+          <w:sz w:val="21"/>
+        </w:rPr>
+        <w:t>Key Specific Objectives:</w:t>
+      </w:r>
+    </w:p>
+    <w:p>
+      <w:pPr>
+        <w:pStyle w:val="ListBullet"/>
+        <w:spacing w:before="0" w:after="50" w:line="276" w:lineRule="auto"/>
+      </w:pPr>
+      <w:r>
+        <w:rPr>
+          <w:rFonts w:ascii="Calibri" w:hAnsi="Calibri"/>
+          <w:b/>
+          <w:color w:val="1A202C"/>
+          <w:sz w:val="21"/>
+        </w:rPr>
+        <w:t xml:space="preserve">Problem Diagnosis: </w:t>
+      </w:r>
+      <w:r>
+        <w:rPr>
+          <w:rFonts w:ascii="Calibri" w:hAnsi="Calibri"/>
+          <w:color w:val="1A202C"/>
+          <w:sz w:val="21"/>
+        </w:rPr>
+        <w:t>Identify and analyze key operational bottlenecks faced by freelancers, gig consultants, and small-to-medium enterprises (SMEs) in manual billing and payment collection.</w:t>
+      </w:r>
+    </w:p>
+    <w:p>
+      <w:pPr>
+        <w:pStyle w:val="ListBullet"/>
+        <w:spacing w:before="0" w:after="50" w:line="276" w:lineRule="auto"/>
+      </w:pPr>
+      <w:r>
+        <w:rPr>
+          <w:rFonts w:ascii="Calibri" w:hAnsi="Calibri"/>
+          <w:b/>
+          <w:color w:val="1A202C"/>
+          <w:sz w:val="21"/>
+        </w:rPr>
+        <w:t xml:space="preserve">Scope Formulation: </w:t>
+      </w:r>
+      <w:r>
+        <w:rPr>
+          <w:rFonts w:ascii="Calibri" w:hAnsi="Calibri"/>
+          <w:color w:val="1A202C"/>
+          <w:sz w:val="21"/>
+        </w:rPr>
+        <w:t>Establish clear functional and technical system boundaries separating client-side capabilities from cloud-dependent ERP workflows.</w:t>
+      </w:r>
+    </w:p>
+    <w:p>
+      <w:pPr>
+        <w:pStyle w:val="ListBullet"/>
+        <w:spacing w:before="0" w:after="50" w:line="276" w:lineRule="auto"/>
+      </w:pPr>
+      <w:r>
+        <w:rPr>
+          <w:rFonts w:ascii="Calibri" w:hAnsi="Calibri"/>
+          <w:b/>
+          <w:color w:val="1A202C"/>
+          <w:sz w:val="21"/>
+        </w:rPr>
+        <w:t xml:space="preserve">Feasibility Assessment: </w:t>
+      </w:r>
+      <w:r>
+        <w:rPr>
+          <w:rFonts w:ascii="Calibri" w:hAnsi="Calibri"/>
+          <w:color w:val="1A202C"/>
+          <w:sz w:val="21"/>
+        </w:rPr>
+        <w:t>Conduct comprehensive feasibility analysis covering Technical, Operational, Economic, and Schedule dimensions.</w:t>
+      </w:r>
+    </w:p>
+    <w:p>
+      <w:pPr>
+        <w:pStyle w:val="ListBullet"/>
+        <w:spacing w:before="0" w:after="50" w:line="276" w:lineRule="auto"/>
+      </w:pPr>
+      <w:r>
+        <w:rPr>
+          <w:rFonts w:ascii="Calibri" w:hAnsi="Calibri"/>
+          <w:b/>
+          <w:color w:val="1A202C"/>
+          <w:sz w:val="21"/>
+        </w:rPr>
+        <w:t xml:space="preserve">Persona Modeling: </w:t>
+      </w:r>
+      <w:r>
+        <w:rPr>
+          <w:rFonts w:ascii="Calibri" w:hAnsi="Calibri"/>
+          <w:color w:val="1A202C"/>
+          <w:sz w:val="21"/>
+        </w:rPr>
+        <w:t>Formulate a formal Stakeholder and User Persona matrix to guide architectural decisions throughout the SDLC.</w:t>
       </w:r>
     </w:p>
     <w:p>
       <w:pPr>
         <w:pStyle w:val="Heading2"/>
+        <w:spacing w:before="200" w:after="60"/>
       </w:pPr>
       <w:r>
         <w:rPr>
           <w:rFonts w:ascii="Calibri" w:hAnsi="Calibri"/>
           <w:b/>
           <w:color w:val="2C3E50"/>
-          <w:sz w:val="26"/>
+          <w:sz w:val="25"/>
         </w:rPr>
-        <w:t>2. Problem Statement</w:t>
+        <w:t>2. Pre-Requisites</w:t>
       </w:r>
     </w:p>
     <w:p>
+      <w:pPr>
+        <w:pStyle w:val="ListBullet"/>
+        <w:spacing w:before="0" w:after="50" w:line="276" w:lineRule="auto"/>
+      </w:pPr>
       <w:r>
-        <w:t>Freelancers, consultants, contractors, and small-to-medium enterprise (SME) owners frequently struggle with creating, tracking, and maintaining professional invoices. Currently, billing is often handled manually through error-prone spreadsheet templates, generic Word documents, or bulky subscription-based accounting software that requires mandatory internet connectivity and complex setups.</w:t>
-        <w:br/>
-        <w:br/>
-        <w:t>This leads to severe operational bottlenecks: calculation mistakes in tax and discount rates, inconsistent invoice numbering, lack of audit trails for partial payment settlements, missing client directories, and delays in payment collection.</w:t>
-        <w:br/>
-        <w:br/>
-        <w:t>The goal is to design and develop 'Ledgerly' — a high-performance, offline-first Progressive Web Application (PWA) Invoice and Quotation Management System. Ledgerly allows users to swiftly compile professional invoices and estimates, automatically calculate multi-tier taxes (CGST/SGST/IGST), collect digital signatures on canvas, generate instant UPI payment QR codes, track partial payment ledgers, and export print-ready PDFs directly in the browser without third-party server lock-in.</w:t>
+        <w:rPr>
+          <w:rFonts w:ascii="Calibri" w:hAnsi="Calibri"/>
+          <w:color w:val="1A202C"/>
+          <w:sz w:val="21"/>
+        </w:rPr>
+        <w:t>Fundamentals of Software Engineering Life Cycles (Agile, Waterfall, and Spiral paradigms).</w:t>
+      </w:r>
+    </w:p>
+    <w:p>
+      <w:pPr>
+        <w:pStyle w:val="ListBullet"/>
+        <w:spacing w:before="0" w:after="50" w:line="276" w:lineRule="auto"/>
+      </w:pPr>
+      <w:r>
+        <w:rPr>
+          <w:rFonts w:ascii="Calibri" w:hAnsi="Calibri"/>
+          <w:color w:val="1A202C"/>
+          <w:sz w:val="21"/>
+        </w:rPr>
+        <w:t>Basic principles of commercial invoicing, Indian Goods and Services Tax (GST) taxation hierarchies, and UPI instant settlements.</w:t>
+      </w:r>
+    </w:p>
+    <w:p>
+      <w:pPr>
+        <w:pStyle w:val="ListBullet"/>
+        <w:spacing w:before="0" w:after="50" w:line="276" w:lineRule="auto"/>
+      </w:pPr>
+      <w:r>
+        <w:rPr>
+          <w:rFonts w:ascii="Calibri" w:hAnsi="Calibri"/>
+          <w:color w:val="1A202C"/>
+          <w:sz w:val="21"/>
+        </w:rPr>
+        <w:t>Understanding of browser storage models (localStorage, IndexedDB) and Progressive Web Application (PWA) offline capabilities.</w:t>
       </w:r>
     </w:p>
     <w:p>
       <w:pPr>
         <w:pStyle w:val="Heading2"/>
+        <w:spacing w:before="200" w:after="60"/>
       </w:pPr>
       <w:r>
         <w:rPr>
           <w:rFonts w:ascii="Calibri" w:hAnsi="Calibri"/>
           <w:b/>
           <w:color w:val="2C3E50"/>
-          <w:sz w:val="26"/>
+          <w:sz w:val="25"/>
         </w:rPr>
-        <w:t>3. Theory</w:t>
-      </w:r>
-    </w:p>
-    <w:p>
-      <w:pPr>
-        <w:pStyle w:val="Heading3"/>
-      </w:pPr>
-      <w:r>
-        <w:rPr>
-          <w:rFonts w:ascii="Calibri" w:hAnsi="Calibri"/>
-          <w:b/>
-          <w:color w:val="34495E"/>
-          <w:sz w:val="22"/>
-        </w:rPr>
-        <w:t>3.1 Project Conceptualization</w:t>
-      </w:r>
-    </w:p>
-    <w:p>
-      <w:r>
-        <w:t>Project conceptualization involves identifying core user pain points, establishing system boundaries, determining key user personas, and specifying architectural feasibility. Key elements include:</w:t>
-        <w:br/>
-        <w:t>• Project Scope – Defining clear functional boundaries (In-Scope vs. Out-of-Scope).</w:t>
-        <w:br/>
-        <w:t>• Stakeholder &amp; Actor Identification – Identifying who creates, approves, and receives invoices.</w:t>
-        <w:br/>
-        <w:t>• Core Functional Modules – Grouping operations into cohesive functional subsystems.</w:t>
-        <w:br/>
-        <w:t>• Feasibility Analysis – Assessing technical, operational, and financial feasibility.</w:t>
-      </w:r>
-    </w:p>
-    <w:p>
-      <w:pPr>
-        <w:pStyle w:val="Heading3"/>
-      </w:pPr>
-      <w:r>
-        <w:rPr>
-          <w:rFonts w:ascii="Calibri" w:hAnsi="Calibri"/>
-          <w:b/>
-          <w:color w:val="34495E"/>
-          <w:sz w:val="22"/>
-        </w:rPr>
-        <w:t>3.2 Need for a Client-Side Modern Invoicing Engine</w:t>
-      </w:r>
-    </w:p>
-    <w:p>
-      <w:r>
-        <w:t>Traditional desktop and cloud ERP systems have several disadvantages for micro-enterprises:</w:t>
-        <w:br/>
-        <w:t>• High monthly recurring subscription costs.</w:t>
-        <w:br/>
-        <w:t>• Rigid templates with limited on-device custom styling.</w:t>
-        <w:br/>
-        <w:t>• Dependency on uninterrupted cloud internet connectivity.</w:t>
-        <w:br/>
-        <w:t>• Privacy risks when uploading sensitive financial and customer contact data to third-party databases.</w:t>
-        <w:br/>
-        <w:t>An offline-first, client-rendered web application guarantees immediate availability, zero subscription cost, and total data privacy.</w:t>
-      </w:r>
-    </w:p>
-    <w:p>
-      <w:pPr>
-        <w:pStyle w:val="Heading2"/>
-      </w:pPr>
-      <w:r>
-        <w:rPr>
-          <w:rFonts w:ascii="Calibri" w:hAnsi="Calibri"/>
-          <w:b/>
-          <w:color w:val="2C3E50"/>
-          <w:sz w:val="26"/>
-        </w:rPr>
-        <w:t>4. Project Scope</w:t>
-      </w:r>
-    </w:p>
-    <w:p>
-      <w:pPr>
-        <w:pStyle w:val="Heading3"/>
-      </w:pPr>
-      <w:r>
-        <w:rPr>
-          <w:rFonts w:ascii="Calibri" w:hAnsi="Calibri"/>
-          <w:b/>
-          <w:color w:val="34495E"/>
-          <w:sz w:val="22"/>
-        </w:rPr>
-        <w:t>4.1 In-Scope Functionalities</w:t>
-      </w:r>
-    </w:p>
-    <w:p>
-      <w:r>
-        <w:t>1. Enterprise Profile Management: Configure company name, GSTIN, address, logo, bank details, and UPI ID.</w:t>
-        <w:br/>
-        <w:t>2. Customer Directory: Maintain client records with GSTIN, email, phone, and billing address.</w:t>
-        <w:br/>
-        <w:t>3. Dynamic Line-Item Builder: Real-time item rows with HSN codes, quantity, unit price, and itemized tax rates.</w:t>
-        <w:br/>
-        <w:t>4. Automated Calculation Engine: Instant computation of subtotal, flat/percentage discounts, intra/inter-state GST, additional charges, and integer round-off.</w:t>
-        <w:br/>
-        <w:t>5. Canvas Digital Signature: Native HTML5 canvas capture for handwritten signatures.</w:t>
-        <w:br/>
-        <w:t>6. Dynamic UPI QR Code: On-the-fly payment QR generation using UPI deep-links.</w:t>
-        <w:br/>
-        <w:t>7. Payment Settlement Ledger: Record multiple installment payments (Cash, UPI, NEFT, Card) and compute remaining balance due.</w:t>
-        <w:br/>
-        <w:t>8. Multi-Template PDF &amp; Print Export: 4 design presets (Classic, Modern Teal, Minimal, Compact) with lossless browser print and direct PDF download.</w:t>
-        <w:br/>
-        <w:t>9. Offline-First PWA: Service worker asset caching and local browser storage persistence.</w:t>
-      </w:r>
-    </w:p>
-    <w:p>
-      <w:pPr>
-        <w:pStyle w:val="Heading3"/>
-      </w:pPr>
-      <w:r>
-        <w:rPr>
-          <w:rFonts w:ascii="Calibri" w:hAnsi="Calibri"/>
-          <w:b/>
-          <w:color w:val="34495E"/>
-          <w:sz w:val="22"/>
-        </w:rPr>
-        <w:t>4.2 Out-of-Scope (Future Enhancements)</w:t>
-      </w:r>
-    </w:p>
-    <w:p>
-      <w:r>
-        <w:t>• Direct bank-to-bank automated reconciliation API.</w:t>
-        <w:br/>
-        <w:t>• Multi-tenant centralized cloud database sync.</w:t>
-        <w:br/>
-        <w:t>• Native mobile app binary deployment (App Store / Play Store).</w:t>
-      </w:r>
-    </w:p>
-    <w:p>
-      <w:pPr>
-        <w:pStyle w:val="Heading2"/>
-      </w:pPr>
-      <w:r>
-        <w:rPr>
-          <w:rFonts w:ascii="Calibri" w:hAnsi="Calibri"/>
-          <w:b/>
-          <w:color w:val="2C3E50"/>
-          <w:sz w:val="26"/>
-        </w:rPr>
-        <w:t>5. Stakeholders &amp; User Roles</w:t>
+        <w:t>Hardware &amp; Software Requirements</w:t>
       </w:r>
     </w:p>
     <w:tbl>
       <w:tblPr>
         <w:tblW w:type="auto" w:w="0"/>
         <w:jc w:val="center"/>
-        <w:tblLayout w:type="autofit"/>
+        <w:tblLayout w:type="fixed"/>
         <w:tblLook w:firstColumn="1" w:firstRow="1" w:lastColumn="0" w:lastRow="0" w:noHBand="0" w:noVBand="1" w:val="04A0"/>
+        <w:tblBorders>
+          <w:top w:val="single" w:sz="4" w:space="0" w:color="D1D5DB"/>
+          <w:left w:val="single" w:sz="4" w:space="0" w:color="D1D5DB"/>
+          <w:bottom w:val="single" w:sz="4" w:space="0" w:color="D1D5DB"/>
+          <w:right w:val="single" w:sz="4" w:space="0" w:color="D1D5DB"/>
+          <w:insideH w:val="single" w:sz="4" w:space="0" w:color="D1D5DB"/>
+          <w:insideV w:val="single" w:sz="4" w:space="0" w:color="D1D5DB"/>
+        </w:tblBorders>
       </w:tblPr>
       <w:tblGrid>
-        <w:gridCol w:w="2880"/>
-        <w:gridCol w:w="2880"/>
-        <w:gridCol w:w="2880"/>
+        <w:gridCol w:w="3120"/>
+        <w:gridCol w:w="3120"/>
+        <w:gridCol w:w="3120"/>
       </w:tblGrid>
       <w:tr>
         <w:tc>
           <w:tcPr>
-            <w:tcW w:type="dxa" w:w="2880"/>
+            <w:tcW w:type="dxa" w:w="2160"/>
             <w:shd w:val="clear" w:color="auto" w:fill="1B4D4B"/>
             <w:tcMar>
               <w:top w:w="120" w:type="dxa"/>
               <w:bottom w:w="120" w:type="dxa"/>
-              <w:left w:w="150" w:type="dxa"/>
-              <w:right w:w="150" w:type="dxa"/>
+              <w:left w:w="140" w:type="dxa"/>
+              <w:right w:w="140" w:type="dxa"/>
             </w:tcMar>
           </w:tcPr>
           <w:p>
             <w:pPr>
+              <w:spacing w:before="0" w:after="0"/>
               <w:jc w:val="left"/>
             </w:pPr>
             <w:r>
@@ -633,23 +642,24 @@
                 <w:color w:val="FFFFFF"/>
                 <w:sz w:val="20"/>
               </w:rPr>
-              <w:t>Stakeholder / Role</w:t>
+              <w:t>Category</w:t>
             </w:r>
           </w:p>
         </w:tc>
         <w:tc>
           <w:tcPr>
-            <w:tcW w:type="dxa" w:w="2880"/>
+            <w:tcW w:type="dxa" w:w="3168"/>
             <w:shd w:val="clear" w:color="auto" w:fill="1B4D4B"/>
             <w:tcMar>
               <w:top w:w="120" w:type="dxa"/>
               <w:bottom w:w="120" w:type="dxa"/>
-              <w:left w:w="150" w:type="dxa"/>
-              <w:right w:w="150" w:type="dxa"/>
+              <w:left w:w="140" w:type="dxa"/>
+              <w:right w:w="140" w:type="dxa"/>
             </w:tcMar>
           </w:tcPr>
           <w:p>
             <w:pPr>
+              <w:spacing w:before="0" w:after="0"/>
               <w:jc w:val="left"/>
             </w:pPr>
             <w:r>
@@ -659,23 +669,24 @@
                 <w:color w:val="FFFFFF"/>
                 <w:sz w:val="20"/>
               </w:rPr>
-              <w:t>Description</w:t>
+              <w:t>Component / Specification</w:t>
             </w:r>
           </w:p>
         </w:tc>
         <w:tc>
           <w:tcPr>
-            <w:tcW w:type="dxa" w:w="2880"/>
+            <w:tcW w:type="dxa" w:w="4032"/>
             <w:shd w:val="clear" w:color="auto" w:fill="1B4D4B"/>
             <w:tcMar>
               <w:top w:w="120" w:type="dxa"/>
               <w:bottom w:w="120" w:type="dxa"/>
-              <w:left w:w="150" w:type="dxa"/>
-              <w:right w:w="150" w:type="dxa"/>
+              <w:left w:w="140" w:type="dxa"/>
+              <w:right w:w="140" w:type="dxa"/>
             </w:tcMar>
           </w:tcPr>
           <w:p>
             <w:pPr>
+              <w:spacing w:before="0" w:after="0"/>
               <w:jc w:val="left"/>
             </w:pPr>
             <w:r>
@@ -685,7 +696,7 @@
                 <w:color w:val="FFFFFF"/>
                 <w:sz w:val="20"/>
               </w:rPr>
-              <w:t>Primary System Needs</w:t>
+              <w:t>Minimum Recommended Configuration</w:t>
             </w:r>
           </w:p>
         </w:tc>
@@ -693,76 +704,79 @@
       <w:tr>
         <w:tc>
           <w:tcPr>
-            <w:tcW w:type="dxa" w:w="2880"/>
+            <w:tcW w:type="dxa" w:w="2160"/>
             <w:shd w:val="clear" w:color="auto" w:fill="FFFFFF"/>
             <w:tcMar>
               <w:top w:w="100" w:type="dxa"/>
               <w:bottom w:w="100" w:type="dxa"/>
-              <w:left w:w="150" w:type="dxa"/>
-              <w:right w:w="150" w:type="dxa"/>
+              <w:left w:w="140" w:type="dxa"/>
+              <w:right w:w="140" w:type="dxa"/>
             </w:tcMar>
           </w:tcPr>
           <w:p>
             <w:pPr>
+              <w:spacing w:before="0" w:after="0" w:line="276" w:lineRule="auto"/>
               <w:jc w:val="left"/>
             </w:pPr>
             <w:r>
               <w:rPr>
                 <w:rFonts w:ascii="Calibri" w:hAnsi="Calibri"/>
-                <w:color w:val="333333"/>
+                <w:color w:val="1A202C"/>
                 <w:sz w:val="19"/>
               </w:rPr>
-              <w:t>Freelancer / Contractor</w:t>
+              <w:t>Hardware</w:t>
             </w:r>
           </w:p>
         </w:tc>
         <w:tc>
           <w:tcPr>
-            <w:tcW w:type="dxa" w:w="2880"/>
+            <w:tcW w:type="dxa" w:w="3168"/>
             <w:shd w:val="clear" w:color="auto" w:fill="FFFFFF"/>
             <w:tcMar>
               <w:top w:w="100" w:type="dxa"/>
               <w:bottom w:w="100" w:type="dxa"/>
-              <w:left w:w="150" w:type="dxa"/>
-              <w:right w:w="150" w:type="dxa"/>
+              <w:left w:w="140" w:type="dxa"/>
+              <w:right w:w="140" w:type="dxa"/>
             </w:tcMar>
           </w:tcPr>
           <w:p>
             <w:pPr>
+              <w:spacing w:before="0" w:after="0" w:line="276" w:lineRule="auto"/>
               <w:jc w:val="left"/>
             </w:pPr>
             <w:r>
               <w:rPr>
                 <w:rFonts w:ascii="Calibri" w:hAnsi="Calibri"/>
-                <w:color w:val="333333"/>
+                <w:color w:val="1A202C"/>
                 <w:sz w:val="19"/>
               </w:rPr>
-              <w:t>Independent professional billing clients for hours or milestones.</w:t>
+              <w:t>Processor / CPU</w:t>
             </w:r>
           </w:p>
         </w:tc>
         <w:tc>
           <w:tcPr>
-            <w:tcW w:type="dxa" w:w="2880"/>
+            <w:tcW w:type="dxa" w:w="4032"/>
             <w:shd w:val="clear" w:color="auto" w:fill="FFFFFF"/>
             <w:tcMar>
               <w:top w:w="100" w:type="dxa"/>
               <w:bottom w:w="100" w:type="dxa"/>
-              <w:left w:w="150" w:type="dxa"/>
-              <w:right w:w="150" w:type="dxa"/>
+              <w:left w:w="140" w:type="dxa"/>
+              <w:right w:w="140" w:type="dxa"/>
             </w:tcMar>
           </w:tcPr>
           <w:p>
             <w:pPr>
+              <w:spacing w:before="0" w:after="0" w:line="276" w:lineRule="auto"/>
               <w:jc w:val="left"/>
             </w:pPr>
             <w:r>
               <w:rPr>
                 <w:rFonts w:ascii="Calibri" w:hAnsi="Calibri"/>
-                <w:color w:val="333333"/>
+                <w:color w:val="1A202C"/>
                 <w:sz w:val="19"/>
               </w:rPr>
-              <w:t>Fast quotation creation, UPI payment QR, PDF downloads.</w:t>
+              <w:t>Intel Core i5 / AMD Ryzen 5 or higher (minimum 2.0 GHz)</w:t>
             </w:r>
           </w:p>
         </w:tc>
@@ -770,76 +784,79 @@
       <w:tr>
         <w:tc>
           <w:tcPr>
-            <w:tcW w:type="dxa" w:w="2880"/>
-            <w:shd w:val="clear" w:color="auto" w:fill="F4F6F6"/>
+            <w:tcW w:type="dxa" w:w="2160"/>
+            <w:shd w:val="clear" w:color="auto" w:fill="F7FAFC"/>
             <w:tcMar>
               <w:top w:w="100" w:type="dxa"/>
               <w:bottom w:w="100" w:type="dxa"/>
-              <w:left w:w="150" w:type="dxa"/>
-              <w:right w:w="150" w:type="dxa"/>
+              <w:left w:w="140" w:type="dxa"/>
+              <w:right w:w="140" w:type="dxa"/>
             </w:tcMar>
           </w:tcPr>
           <w:p>
             <w:pPr>
+              <w:spacing w:before="0" w:after="0" w:line="276" w:lineRule="auto"/>
               <w:jc w:val="left"/>
             </w:pPr>
             <w:r>
               <w:rPr>
                 <w:rFonts w:ascii="Calibri" w:hAnsi="Calibri"/>
-                <w:color w:val="333333"/>
+                <w:color w:val="1A202C"/>
                 <w:sz w:val="19"/>
               </w:rPr>
-              <w:t>Small Business Owner / Retailer</w:t>
+              <w:t>Hardware</w:t>
             </w:r>
           </w:p>
         </w:tc>
         <w:tc>
           <w:tcPr>
-            <w:tcW w:type="dxa" w:w="2880"/>
-            <w:shd w:val="clear" w:color="auto" w:fill="F4F6F6"/>
+            <w:tcW w:type="dxa" w:w="3168"/>
+            <w:shd w:val="clear" w:color="auto" w:fill="F7FAFC"/>
             <w:tcMar>
               <w:top w:w="100" w:type="dxa"/>
               <w:bottom w:w="100" w:type="dxa"/>
-              <w:left w:w="150" w:type="dxa"/>
-              <w:right w:w="150" w:type="dxa"/>
+              <w:left w:w="140" w:type="dxa"/>
+              <w:right w:w="140" w:type="dxa"/>
             </w:tcMar>
           </w:tcPr>
           <w:p>
             <w:pPr>
+              <w:spacing w:before="0" w:after="0" w:line="276" w:lineRule="auto"/>
               <w:jc w:val="left"/>
             </w:pPr>
             <w:r>
               <w:rPr>
                 <w:rFonts w:ascii="Calibri" w:hAnsi="Calibri"/>
-                <w:color w:val="333333"/>
+                <w:color w:val="1A202C"/>
                 <w:sz w:val="19"/>
               </w:rPr>
-              <w:t>Commercial store or service enterprise owner.</w:t>
+              <w:t>System Memory (RAM)</w:t>
             </w:r>
           </w:p>
         </w:tc>
         <w:tc>
           <w:tcPr>
-            <w:tcW w:type="dxa" w:w="2880"/>
-            <w:shd w:val="clear" w:color="auto" w:fill="F4F6F6"/>
+            <w:tcW w:type="dxa" w:w="4032"/>
+            <w:shd w:val="clear" w:color="auto" w:fill="F7FAFC"/>
             <w:tcMar>
               <w:top w:w="100" w:type="dxa"/>
               <w:bottom w:w="100" w:type="dxa"/>
-              <w:left w:w="150" w:type="dxa"/>
-              <w:right w:w="150" w:type="dxa"/>
+              <w:left w:w="140" w:type="dxa"/>
+              <w:right w:w="140" w:type="dxa"/>
             </w:tcMar>
           </w:tcPr>
           <w:p>
             <w:pPr>
+              <w:spacing w:before="0" w:after="0" w:line="276" w:lineRule="auto"/>
               <w:jc w:val="left"/>
             </w:pPr>
             <w:r>
               <w:rPr>
                 <w:rFonts w:ascii="Calibri" w:hAnsi="Calibri"/>
-                <w:color w:val="333333"/>
+                <w:color w:val="1A202C"/>
                 <w:sz w:val="19"/>
               </w:rPr>
-              <w:t>GST compliance (CGST/SGST/IGST), customer directory, partial payment tracking.</w:t>
+              <w:t>8.0 GB RAM or higher recommended</w:t>
             </w:r>
           </w:p>
         </w:tc>
@@ -847,76 +864,79 @@
       <w:tr>
         <w:tc>
           <w:tcPr>
-            <w:tcW w:type="dxa" w:w="2880"/>
+            <w:tcW w:type="dxa" w:w="2160"/>
             <w:shd w:val="clear" w:color="auto" w:fill="FFFFFF"/>
             <w:tcMar>
               <w:top w:w="100" w:type="dxa"/>
               <w:bottom w:w="100" w:type="dxa"/>
-              <w:left w:w="150" w:type="dxa"/>
-              <w:right w:w="150" w:type="dxa"/>
+              <w:left w:w="140" w:type="dxa"/>
+              <w:right w:w="140" w:type="dxa"/>
             </w:tcMar>
           </w:tcPr>
           <w:p>
             <w:pPr>
+              <w:spacing w:before="0" w:after="0" w:line="276" w:lineRule="auto"/>
               <w:jc w:val="left"/>
             </w:pPr>
             <w:r>
               <w:rPr>
                 <w:rFonts w:ascii="Calibri" w:hAnsi="Calibri"/>
-                <w:color w:val="333333"/>
+                <w:color w:val="1A202C"/>
                 <w:sz w:val="19"/>
               </w:rPr>
-              <w:t>Accountant / Auditor</w:t>
+              <w:t>Hardware</w:t>
             </w:r>
           </w:p>
         </w:tc>
         <w:tc>
           <w:tcPr>
-            <w:tcW w:type="dxa" w:w="2880"/>
+            <w:tcW w:type="dxa" w:w="3168"/>
             <w:shd w:val="clear" w:color="auto" w:fill="FFFFFF"/>
             <w:tcMar>
               <w:top w:w="100" w:type="dxa"/>
               <w:bottom w:w="100" w:type="dxa"/>
-              <w:left w:w="150" w:type="dxa"/>
-              <w:right w:w="150" w:type="dxa"/>
+              <w:left w:w="140" w:type="dxa"/>
+              <w:right w:w="140" w:type="dxa"/>
             </w:tcMar>
           </w:tcPr>
           <w:p>
             <w:pPr>
+              <w:spacing w:before="0" w:after="0" w:line="276" w:lineRule="auto"/>
               <w:jc w:val="left"/>
             </w:pPr>
             <w:r>
               <w:rPr>
                 <w:rFonts w:ascii="Calibri" w:hAnsi="Calibri"/>
-                <w:color w:val="333333"/>
+                <w:color w:val="1A202C"/>
                 <w:sz w:val="19"/>
               </w:rPr>
-              <w:t>Reviews financial balance and records.</w:t>
+              <w:t>Storage / Disk</w:t>
             </w:r>
           </w:p>
         </w:tc>
         <w:tc>
           <w:tcPr>
-            <w:tcW w:type="dxa" w:w="2880"/>
+            <w:tcW w:type="dxa" w:w="4032"/>
             <w:shd w:val="clear" w:color="auto" w:fill="FFFFFF"/>
             <w:tcMar>
               <w:top w:w="100" w:type="dxa"/>
               <w:bottom w:w="100" w:type="dxa"/>
-              <w:left w:w="150" w:type="dxa"/>
-              <w:right w:w="150" w:type="dxa"/>
+              <w:left w:w="140" w:type="dxa"/>
+              <w:right w:w="140" w:type="dxa"/>
             </w:tcMar>
           </w:tcPr>
           <w:p>
             <w:pPr>
+              <w:spacing w:before="0" w:after="0" w:line="276" w:lineRule="auto"/>
               <w:jc w:val="left"/>
             </w:pPr>
             <w:r>
               <w:rPr>
                 <w:rFonts w:ascii="Calibri" w:hAnsi="Calibri"/>
-                <w:color w:val="333333"/>
+                <w:color w:val="1A202C"/>
                 <w:sz w:val="19"/>
               </w:rPr>
-              <w:t>Receivables aging, payment settlement history, CSV/JSON data backup.</w:t>
+              <w:t>256 GB SSD (Minimum 500 MB free workspace space)</w:t>
             </w:r>
           </w:p>
         </w:tc>
@@ -924,76 +944,559 @@
       <w:tr>
         <w:tc>
           <w:tcPr>
-            <w:tcW w:type="dxa" w:w="2880"/>
-            <w:shd w:val="clear" w:color="auto" w:fill="F4F6F6"/>
+            <w:tcW w:type="dxa" w:w="2160"/>
+            <w:shd w:val="clear" w:color="auto" w:fill="F7FAFC"/>
             <w:tcMar>
               <w:top w:w="100" w:type="dxa"/>
               <w:bottom w:w="100" w:type="dxa"/>
-              <w:left w:w="150" w:type="dxa"/>
-              <w:right w:w="150" w:type="dxa"/>
+              <w:left w:w="140" w:type="dxa"/>
+              <w:right w:w="140" w:type="dxa"/>
             </w:tcMar>
           </w:tcPr>
           <w:p>
             <w:pPr>
+              <w:spacing w:before="0" w:after="0" w:line="276" w:lineRule="auto"/>
               <w:jc w:val="left"/>
             </w:pPr>
             <w:r>
               <w:rPr>
                 <w:rFonts w:ascii="Calibri" w:hAnsi="Calibri"/>
-                <w:color w:val="333333"/>
+                <w:color w:val="1A202C"/>
                 <w:sz w:val="19"/>
               </w:rPr>
-              <w:t>Client / Buyer</w:t>
+              <w:t>Hardware</w:t>
             </w:r>
           </w:p>
         </w:tc>
         <w:tc>
           <w:tcPr>
-            <w:tcW w:type="dxa" w:w="2880"/>
-            <w:shd w:val="clear" w:color="auto" w:fill="F4F6F6"/>
+            <w:tcW w:type="dxa" w:w="3168"/>
+            <w:shd w:val="clear" w:color="auto" w:fill="F7FAFC"/>
             <w:tcMar>
               <w:top w:w="100" w:type="dxa"/>
               <w:bottom w:w="100" w:type="dxa"/>
-              <w:left w:w="150" w:type="dxa"/>
-              <w:right w:w="150" w:type="dxa"/>
+              <w:left w:w="140" w:type="dxa"/>
+              <w:right w:w="140" w:type="dxa"/>
             </w:tcMar>
           </w:tcPr>
           <w:p>
             <w:pPr>
+              <w:spacing w:before="0" w:after="0" w:line="276" w:lineRule="auto"/>
               <w:jc w:val="left"/>
             </w:pPr>
             <w:r>
               <w:rPr>
                 <w:rFonts w:ascii="Calibri" w:hAnsi="Calibri"/>
-                <w:color w:val="333333"/>
+                <w:color w:val="1A202C"/>
                 <w:sz w:val="19"/>
               </w:rPr>
-              <w:t>Recipient of invoice or estimate.</w:t>
+              <w:t>Display / Resolution</w:t>
             </w:r>
           </w:p>
         </w:tc>
         <w:tc>
           <w:tcPr>
-            <w:tcW w:type="dxa" w:w="2880"/>
-            <w:shd w:val="clear" w:color="auto" w:fill="F4F6F6"/>
+            <w:tcW w:type="dxa" w:w="4032"/>
+            <w:shd w:val="clear" w:color="auto" w:fill="F7FAFC"/>
             <w:tcMar>
               <w:top w:w="100" w:type="dxa"/>
               <w:bottom w:w="100" w:type="dxa"/>
-              <w:left w:w="150" w:type="dxa"/>
-              <w:right w:w="150" w:type="dxa"/>
+              <w:left w:w="140" w:type="dxa"/>
+              <w:right w:w="140" w:type="dxa"/>
             </w:tcMar>
           </w:tcPr>
           <w:p>
             <w:pPr>
+              <w:spacing w:before="0" w:after="0" w:line="276" w:lineRule="auto"/>
               <w:jc w:val="left"/>
             </w:pPr>
             <w:r>
               <w:rPr>
                 <w:rFonts w:ascii="Calibri" w:hAnsi="Calibri"/>
-                <w:color w:val="333333"/>
+                <w:color w:val="1A202C"/>
                 <w:sz w:val="19"/>
               </w:rPr>
-              <w:t>Clear itemized charges, accurate tax breakdown, clickable payment link/QR.</w:t>
+              <w:t>1920 x 1080 Full HD (Responsive down to 360 x 640 mobile viewports)</w:t>
+            </w:r>
+          </w:p>
+        </w:tc>
+      </w:tr>
+      <w:tr>
+        <w:tc>
+          <w:tcPr>
+            <w:tcW w:type="dxa" w:w="2160"/>
+            <w:shd w:val="clear" w:color="auto" w:fill="FFFFFF"/>
+            <w:tcMar>
+              <w:top w:w="100" w:type="dxa"/>
+              <w:bottom w:w="100" w:type="dxa"/>
+              <w:left w:w="140" w:type="dxa"/>
+              <w:right w:w="140" w:type="dxa"/>
+            </w:tcMar>
+          </w:tcPr>
+          <w:p>
+            <w:pPr>
+              <w:spacing w:before="0" w:after="0" w:line="276" w:lineRule="auto"/>
+              <w:jc w:val="left"/>
+            </w:pPr>
+            <w:r>
+              <w:rPr>
+                <w:rFonts w:ascii="Calibri" w:hAnsi="Calibri"/>
+                <w:color w:val="1A202C"/>
+                <w:sz w:val="19"/>
+              </w:rPr>
+              <w:t>Software / Runtime</w:t>
+            </w:r>
+          </w:p>
+        </w:tc>
+        <w:tc>
+          <w:tcPr>
+            <w:tcW w:type="dxa" w:w="3168"/>
+            <w:shd w:val="clear" w:color="auto" w:fill="FFFFFF"/>
+            <w:tcMar>
+              <w:top w:w="100" w:type="dxa"/>
+              <w:bottom w:w="100" w:type="dxa"/>
+              <w:left w:w="140" w:type="dxa"/>
+              <w:right w:w="140" w:type="dxa"/>
+            </w:tcMar>
+          </w:tcPr>
+          <w:p>
+            <w:pPr>
+              <w:spacing w:before="0" w:after="0" w:line="276" w:lineRule="auto"/>
+              <w:jc w:val="left"/>
+            </w:pPr>
+            <w:r>
+              <w:rPr>
+                <w:rFonts w:ascii="Calibri" w:hAnsi="Calibri"/>
+                <w:color w:val="1A202C"/>
+                <w:sz w:val="19"/>
+              </w:rPr>
+              <w:t>Operating System</w:t>
+            </w:r>
+          </w:p>
+        </w:tc>
+        <w:tc>
+          <w:tcPr>
+            <w:tcW w:type="dxa" w:w="4032"/>
+            <w:shd w:val="clear" w:color="auto" w:fill="FFFFFF"/>
+            <w:tcMar>
+              <w:top w:w="100" w:type="dxa"/>
+              <w:bottom w:w="100" w:type="dxa"/>
+              <w:left w:w="140" w:type="dxa"/>
+              <w:right w:w="140" w:type="dxa"/>
+            </w:tcMar>
+          </w:tcPr>
+          <w:p>
+            <w:pPr>
+              <w:spacing w:before="0" w:after="0" w:line="276" w:lineRule="auto"/>
+              <w:jc w:val="left"/>
+            </w:pPr>
+            <w:r>
+              <w:rPr>
+                <w:rFonts w:ascii="Calibri" w:hAnsi="Calibri"/>
+                <w:color w:val="1A202C"/>
+                <w:sz w:val="19"/>
+              </w:rPr>
+              <w:t>Windows 11 / 10 (64-bit) / Ubuntu Linux / macOS</w:t>
+            </w:r>
+          </w:p>
+        </w:tc>
+      </w:tr>
+      <w:tr>
+        <w:tc>
+          <w:tcPr>
+            <w:tcW w:type="dxa" w:w="2160"/>
+            <w:shd w:val="clear" w:color="auto" w:fill="F7FAFC"/>
+            <w:tcMar>
+              <w:top w:w="100" w:type="dxa"/>
+              <w:bottom w:w="100" w:type="dxa"/>
+              <w:left w:w="140" w:type="dxa"/>
+              <w:right w:w="140" w:type="dxa"/>
+            </w:tcMar>
+          </w:tcPr>
+          <w:p>
+            <w:pPr>
+              <w:spacing w:before="0" w:after="0" w:line="276" w:lineRule="auto"/>
+              <w:jc w:val="left"/>
+            </w:pPr>
+            <w:r>
+              <w:rPr>
+                <w:rFonts w:ascii="Calibri" w:hAnsi="Calibri"/>
+                <w:color w:val="1A202C"/>
+                <w:sz w:val="19"/>
+              </w:rPr>
+              <w:t>Software / Runtime</w:t>
+            </w:r>
+          </w:p>
+        </w:tc>
+        <w:tc>
+          <w:tcPr>
+            <w:tcW w:type="dxa" w:w="3168"/>
+            <w:shd w:val="clear" w:color="auto" w:fill="F7FAFC"/>
+            <w:tcMar>
+              <w:top w:w="100" w:type="dxa"/>
+              <w:bottom w:w="100" w:type="dxa"/>
+              <w:left w:w="140" w:type="dxa"/>
+              <w:right w:w="140" w:type="dxa"/>
+            </w:tcMar>
+          </w:tcPr>
+          <w:p>
+            <w:pPr>
+              <w:spacing w:before="0" w:after="0" w:line="276" w:lineRule="auto"/>
+              <w:jc w:val="left"/>
+            </w:pPr>
+            <w:r>
+              <w:rPr>
+                <w:rFonts w:ascii="Calibri" w:hAnsi="Calibri"/>
+                <w:color w:val="1A202C"/>
+                <w:sz w:val="19"/>
+              </w:rPr>
+              <w:t>Web Browser</w:t>
+            </w:r>
+          </w:p>
+        </w:tc>
+        <w:tc>
+          <w:tcPr>
+            <w:tcW w:type="dxa" w:w="4032"/>
+            <w:shd w:val="clear" w:color="auto" w:fill="F7FAFC"/>
+            <w:tcMar>
+              <w:top w:w="100" w:type="dxa"/>
+              <w:bottom w:w="100" w:type="dxa"/>
+              <w:left w:w="140" w:type="dxa"/>
+              <w:right w:w="140" w:type="dxa"/>
+            </w:tcMar>
+          </w:tcPr>
+          <w:p>
+            <w:pPr>
+              <w:spacing w:before="0" w:after="0" w:line="276" w:lineRule="auto"/>
+              <w:jc w:val="left"/>
+            </w:pPr>
+            <w:r>
+              <w:rPr>
+                <w:rFonts w:ascii="Calibri" w:hAnsi="Calibri"/>
+                <w:color w:val="1A202C"/>
+                <w:sz w:val="19"/>
+              </w:rPr>
+              <w:t>Google Chrome (v110+), Mozilla Firefox (v115+), Microsoft Edge</w:t>
+            </w:r>
+          </w:p>
+        </w:tc>
+      </w:tr>
+      <w:tr>
+        <w:tc>
+          <w:tcPr>
+            <w:tcW w:type="dxa" w:w="2160"/>
+            <w:shd w:val="clear" w:color="auto" w:fill="FFFFFF"/>
+            <w:tcMar>
+              <w:top w:w="100" w:type="dxa"/>
+              <w:bottom w:w="100" w:type="dxa"/>
+              <w:left w:w="140" w:type="dxa"/>
+              <w:right w:w="140" w:type="dxa"/>
+            </w:tcMar>
+          </w:tcPr>
+          <w:p>
+            <w:pPr>
+              <w:spacing w:before="0" w:after="0" w:line="276" w:lineRule="auto"/>
+              <w:jc w:val="left"/>
+            </w:pPr>
+            <w:r>
+              <w:rPr>
+                <w:rFonts w:ascii="Calibri" w:hAnsi="Calibri"/>
+                <w:color w:val="1A202C"/>
+                <w:sz w:val="19"/>
+              </w:rPr>
+              <w:t>Software / Runtime</w:t>
+            </w:r>
+          </w:p>
+        </w:tc>
+        <w:tc>
+          <w:tcPr>
+            <w:tcW w:type="dxa" w:w="3168"/>
+            <w:shd w:val="clear" w:color="auto" w:fill="FFFFFF"/>
+            <w:tcMar>
+              <w:top w:w="100" w:type="dxa"/>
+              <w:bottom w:w="100" w:type="dxa"/>
+              <w:left w:w="140" w:type="dxa"/>
+              <w:right w:w="140" w:type="dxa"/>
+            </w:tcMar>
+          </w:tcPr>
+          <w:p>
+            <w:pPr>
+              <w:spacing w:before="0" w:after="0" w:line="276" w:lineRule="auto"/>
+              <w:jc w:val="left"/>
+            </w:pPr>
+            <w:r>
+              <w:rPr>
+                <w:rFonts w:ascii="Calibri" w:hAnsi="Calibri"/>
+                <w:color w:val="1A202C"/>
+                <w:sz w:val="19"/>
+              </w:rPr>
+              <w:t>Core Technologies</w:t>
+            </w:r>
+          </w:p>
+        </w:tc>
+        <w:tc>
+          <w:tcPr>
+            <w:tcW w:type="dxa" w:w="4032"/>
+            <w:shd w:val="clear" w:color="auto" w:fill="FFFFFF"/>
+            <w:tcMar>
+              <w:top w:w="100" w:type="dxa"/>
+              <w:bottom w:w="100" w:type="dxa"/>
+              <w:left w:w="140" w:type="dxa"/>
+              <w:right w:w="140" w:type="dxa"/>
+            </w:tcMar>
+          </w:tcPr>
+          <w:p>
+            <w:pPr>
+              <w:spacing w:before="0" w:after="0" w:line="276" w:lineRule="auto"/>
+              <w:jc w:val="left"/>
+            </w:pPr>
+            <w:r>
+              <w:rPr>
+                <w:rFonts w:ascii="Calibri" w:hAnsi="Calibri"/>
+                <w:color w:val="1A202C"/>
+                <w:sz w:val="19"/>
+              </w:rPr>
+              <w:t>HTML5, Vanilla CSS3 (Custom Variables), ECMAScript 2022 (Pure Vanilla JS)</w:t>
+            </w:r>
+          </w:p>
+        </w:tc>
+      </w:tr>
+      <w:tr>
+        <w:tc>
+          <w:tcPr>
+            <w:tcW w:type="dxa" w:w="2160"/>
+            <w:shd w:val="clear" w:color="auto" w:fill="F7FAFC"/>
+            <w:tcMar>
+              <w:top w:w="100" w:type="dxa"/>
+              <w:bottom w:w="100" w:type="dxa"/>
+              <w:left w:w="140" w:type="dxa"/>
+              <w:right w:w="140" w:type="dxa"/>
+            </w:tcMar>
+          </w:tcPr>
+          <w:p>
+            <w:pPr>
+              <w:spacing w:before="0" w:after="0" w:line="276" w:lineRule="auto"/>
+              <w:jc w:val="left"/>
+            </w:pPr>
+            <w:r>
+              <w:rPr>
+                <w:rFonts w:ascii="Calibri" w:hAnsi="Calibri"/>
+                <w:color w:val="1A202C"/>
+                <w:sz w:val="19"/>
+              </w:rPr>
+              <w:t>Software / Runtime</w:t>
+            </w:r>
+          </w:p>
+        </w:tc>
+        <w:tc>
+          <w:tcPr>
+            <w:tcW w:type="dxa" w:w="3168"/>
+            <w:shd w:val="clear" w:color="auto" w:fill="F7FAFC"/>
+            <w:tcMar>
+              <w:top w:w="100" w:type="dxa"/>
+              <w:bottom w:w="100" w:type="dxa"/>
+              <w:left w:w="140" w:type="dxa"/>
+              <w:right w:w="140" w:type="dxa"/>
+            </w:tcMar>
+          </w:tcPr>
+          <w:p>
+            <w:pPr>
+              <w:spacing w:before="0" w:after="0" w:line="276" w:lineRule="auto"/>
+              <w:jc w:val="left"/>
+            </w:pPr>
+            <w:r>
+              <w:rPr>
+                <w:rFonts w:ascii="Calibri" w:hAnsi="Calibri"/>
+                <w:color w:val="1A202C"/>
+                <w:sz w:val="19"/>
+              </w:rPr>
+              <w:t>Runtime &amp; Tooling</w:t>
+            </w:r>
+          </w:p>
+        </w:tc>
+        <w:tc>
+          <w:tcPr>
+            <w:tcW w:type="dxa" w:w="4032"/>
+            <w:shd w:val="clear" w:color="auto" w:fill="F7FAFC"/>
+            <w:tcMar>
+              <w:top w:w="100" w:type="dxa"/>
+              <w:bottom w:w="100" w:type="dxa"/>
+              <w:left w:w="140" w:type="dxa"/>
+              <w:right w:w="140" w:type="dxa"/>
+            </w:tcMar>
+          </w:tcPr>
+          <w:p>
+            <w:pPr>
+              <w:spacing w:before="0" w:after="0" w:line="276" w:lineRule="auto"/>
+              <w:jc w:val="left"/>
+            </w:pPr>
+            <w:r>
+              <w:rPr>
+                <w:rFonts w:ascii="Calibri" w:hAnsi="Calibri"/>
+                <w:color w:val="1A202C"/>
+                <w:sz w:val="19"/>
+              </w:rPr>
+              <w:t>Node.js LTS (v20+) for local asset bundling &amp; Python 3.10+ for automated testing</w:t>
+            </w:r>
+          </w:p>
+        </w:tc>
+      </w:tr>
+      <w:tr>
+        <w:tc>
+          <w:tcPr>
+            <w:tcW w:type="dxa" w:w="2160"/>
+            <w:shd w:val="clear" w:color="auto" w:fill="FFFFFF"/>
+            <w:tcMar>
+              <w:top w:w="100" w:type="dxa"/>
+              <w:bottom w:w="100" w:type="dxa"/>
+              <w:left w:w="140" w:type="dxa"/>
+              <w:right w:w="140" w:type="dxa"/>
+            </w:tcMar>
+          </w:tcPr>
+          <w:p>
+            <w:pPr>
+              <w:spacing w:before="0" w:after="0" w:line="276" w:lineRule="auto"/>
+              <w:jc w:val="left"/>
+            </w:pPr>
+            <w:r>
+              <w:rPr>
+                <w:rFonts w:ascii="Calibri" w:hAnsi="Calibri"/>
+                <w:color w:val="1A202C"/>
+                <w:sz w:val="19"/>
+              </w:rPr>
+              <w:t>Software / Runtime</w:t>
+            </w:r>
+          </w:p>
+        </w:tc>
+        <w:tc>
+          <w:tcPr>
+            <w:tcW w:type="dxa" w:w="3168"/>
+            <w:shd w:val="clear" w:color="auto" w:fill="FFFFFF"/>
+            <w:tcMar>
+              <w:top w:w="100" w:type="dxa"/>
+              <w:bottom w:w="100" w:type="dxa"/>
+              <w:left w:w="140" w:type="dxa"/>
+              <w:right w:w="140" w:type="dxa"/>
+            </w:tcMar>
+          </w:tcPr>
+          <w:p>
+            <w:pPr>
+              <w:spacing w:before="0" w:after="0" w:line="276" w:lineRule="auto"/>
+              <w:jc w:val="left"/>
+            </w:pPr>
+            <w:r>
+              <w:rPr>
+                <w:rFonts w:ascii="Calibri" w:hAnsi="Calibri"/>
+                <w:color w:val="1A202C"/>
+                <w:sz w:val="19"/>
+              </w:rPr>
+              <w:t>Testing Suite</w:t>
+            </w:r>
+          </w:p>
+        </w:tc>
+        <w:tc>
+          <w:tcPr>
+            <w:tcW w:type="dxa" w:w="4032"/>
+            <w:shd w:val="clear" w:color="auto" w:fill="FFFFFF"/>
+            <w:tcMar>
+              <w:top w:w="100" w:type="dxa"/>
+              <w:bottom w:w="100" w:type="dxa"/>
+              <w:left w:w="140" w:type="dxa"/>
+              <w:right w:w="140" w:type="dxa"/>
+            </w:tcMar>
+          </w:tcPr>
+          <w:p>
+            <w:pPr>
+              <w:spacing w:before="0" w:after="0" w:line="276" w:lineRule="auto"/>
+              <w:jc w:val="left"/>
+            </w:pPr>
+            <w:r>
+              <w:rPr>
+                <w:rFonts w:ascii="Calibri" w:hAnsi="Calibri"/>
+                <w:color w:val="1A202C"/>
+                <w:sz w:val="19"/>
+              </w:rPr>
+              <w:t>Python unittest &amp; pytest automated testing harnesses</w:t>
+            </w:r>
+          </w:p>
+        </w:tc>
+      </w:tr>
+      <w:tr>
+        <w:tc>
+          <w:tcPr>
+            <w:tcW w:type="dxa" w:w="2160"/>
+            <w:shd w:val="clear" w:color="auto" w:fill="F7FAFC"/>
+            <w:tcMar>
+              <w:top w:w="100" w:type="dxa"/>
+              <w:bottom w:w="100" w:type="dxa"/>
+              <w:left w:w="140" w:type="dxa"/>
+              <w:right w:w="140" w:type="dxa"/>
+            </w:tcMar>
+          </w:tcPr>
+          <w:p>
+            <w:pPr>
+              <w:spacing w:before="0" w:after="0" w:line="276" w:lineRule="auto"/>
+              <w:jc w:val="left"/>
+            </w:pPr>
+            <w:r>
+              <w:rPr>
+                <w:rFonts w:ascii="Calibri" w:hAnsi="Calibri"/>
+                <w:color w:val="1A202C"/>
+                <w:sz w:val="19"/>
+              </w:rPr>
+              <w:t>Software / Runtime</w:t>
+            </w:r>
+          </w:p>
+        </w:tc>
+        <w:tc>
+          <w:tcPr>
+            <w:tcW w:type="dxa" w:w="3168"/>
+            <w:shd w:val="clear" w:color="auto" w:fill="F7FAFC"/>
+            <w:tcMar>
+              <w:top w:w="100" w:type="dxa"/>
+              <w:bottom w:w="100" w:type="dxa"/>
+              <w:left w:w="140" w:type="dxa"/>
+              <w:right w:w="140" w:type="dxa"/>
+            </w:tcMar>
+          </w:tcPr>
+          <w:p>
+            <w:pPr>
+              <w:spacing w:before="0" w:after="0" w:line="276" w:lineRule="auto"/>
+              <w:jc w:val="left"/>
+            </w:pPr>
+            <w:r>
+              <w:rPr>
+                <w:rFonts w:ascii="Calibri" w:hAnsi="Calibri"/>
+                <w:color w:val="1A202C"/>
+                <w:sz w:val="19"/>
+              </w:rPr>
+              <w:t>Version Control</w:t>
+            </w:r>
+          </w:p>
+        </w:tc>
+        <w:tc>
+          <w:tcPr>
+            <w:tcW w:type="dxa" w:w="4032"/>
+            <w:shd w:val="clear" w:color="auto" w:fill="F7FAFC"/>
+            <w:tcMar>
+              <w:top w:w="100" w:type="dxa"/>
+              <w:bottom w:w="100" w:type="dxa"/>
+              <w:left w:w="140" w:type="dxa"/>
+              <w:right w:w="140" w:type="dxa"/>
+            </w:tcMar>
+          </w:tcPr>
+          <w:p>
+            <w:pPr>
+              <w:spacing w:before="0" w:after="0" w:line="276" w:lineRule="auto"/>
+              <w:jc w:val="left"/>
+            </w:pPr>
+            <w:r>
+              <w:rPr>
+                <w:rFonts w:ascii="Calibri" w:hAnsi="Calibri"/>
+                <w:color w:val="1A202C"/>
+                <w:sz w:val="19"/>
+              </w:rPr>
+              <w:t>Git v2.40+ &amp; GitHub Pages CI/CD deployment</w:t>
             </w:r>
           </w:p>
         </w:tc>
@@ -1003,494 +1506,141 @@
     <w:p>
       <w:pPr>
         <w:pStyle w:val="Heading2"/>
+        <w:spacing w:before="200" w:after="60"/>
       </w:pPr>
       <w:r>
         <w:rPr>
           <w:rFonts w:ascii="Calibri" w:hAnsi="Calibri"/>
           <w:b/>
           <w:color w:val="2C3E50"/>
-          <w:sz w:val="26"/>
+          <w:sz w:val="25"/>
         </w:rPr>
-        <w:t>6. Core Modules of the System</w:t>
+        <w:t>3. Problem Statement &amp; Background</w:t>
+      </w:r>
+    </w:p>
+    <w:p>
+      <w:pPr>
+        <w:spacing w:before="0" w:after="90" w:line="276" w:lineRule="auto"/>
+      </w:pPr>
+      <w:r>
+        <w:rPr>
+          <w:rFonts w:ascii="Calibri" w:hAnsi="Calibri"/>
+          <w:color w:val="1A202C"/>
+          <w:sz w:val="21"/>
+        </w:rPr>
+        <w:t>Modern micro-entrepreneurs, freelancers, and small businesses face severe administrative drag when generating client invoices. The current landscape forces users into an uncomfortable dichotomy:</w:t>
+      </w:r>
+    </w:p>
+    <w:p>
+      <w:pPr>
+        <w:pStyle w:val="ListBullet"/>
+        <w:spacing w:before="0" w:after="50" w:line="276" w:lineRule="auto"/>
+      </w:pPr>
+      <w:r>
+        <w:rPr>
+          <w:rFonts w:ascii="Calibri" w:hAnsi="Calibri"/>
+          <w:b/>
+          <w:color w:val="1A202C"/>
+          <w:sz w:val="21"/>
+        </w:rPr>
+        <w:t xml:space="preserve">Primitive Tooling: </w:t>
+      </w:r>
+      <w:r>
+        <w:rPr>
+          <w:rFonts w:ascii="Calibri" w:hAnsi="Calibri"/>
+          <w:color w:val="1A202C"/>
+          <w:sz w:val="21"/>
+        </w:rPr>
+        <w:t>Error-prone manual templates (Microsoft Word or Excel) lacking real-time validation, automatic tax calculation, payment status tracking, and signature capture.</w:t>
+      </w:r>
+    </w:p>
+    <w:p>
+      <w:pPr>
+        <w:pStyle w:val="ListBullet"/>
+        <w:spacing w:before="0" w:after="50" w:line="276" w:lineRule="auto"/>
+      </w:pPr>
+      <w:r>
+        <w:rPr>
+          <w:rFonts w:ascii="Calibri" w:hAnsi="Calibri"/>
+          <w:b/>
+          <w:color w:val="1A202C"/>
+          <w:sz w:val="21"/>
+        </w:rPr>
+        <w:t xml:space="preserve">Bloated Cloud Solutions: </w:t>
+      </w:r>
+      <w:r>
+        <w:rPr>
+          <w:rFonts w:ascii="Calibri" w:hAnsi="Calibri"/>
+          <w:color w:val="1A202C"/>
+          <w:sz w:val="21"/>
+        </w:rPr>
+        <w:t>Monolithic cloud ERPs (Zoho Books, Tally, QuickBooks) imposing steep recurring subscriptions, complex configuration overhead, mandatory internet connectivity, and privacy risks associated with uploading client contact records to third-party multi-tenant databases.</w:t>
+      </w:r>
+    </w:p>
+    <w:p>
+      <w:pPr>
+        <w:spacing w:before="0" w:after="90" w:line="276" w:lineRule="auto"/>
+      </w:pPr>
+      <w:r>
+        <w:rPr>
+          <w:rFonts w:ascii="Calibri" w:hAnsi="Calibri"/>
+          <w:color w:val="1A202C"/>
+          <w:sz w:val="21"/>
+        </w:rPr>
+        <w:t>This friction leads to calculation errors in multi-tier tax rates (CGST, SGST, IGST), broken invoice numbering sequences, delayed invoice disbursements, and untracked partial payments.</w:t>
       </w:r>
     </w:p>
     <w:tbl>
       <w:tblPr>
         <w:tblW w:type="auto" w:w="0"/>
         <w:jc w:val="center"/>
-        <w:tblLayout w:type="autofit"/>
         <w:tblLook w:firstColumn="1" w:firstRow="1" w:lastColumn="0" w:lastRow="0" w:noHBand="0" w:noVBand="1" w:val="04A0"/>
+        <w:tblBorders>
+          <w:left w:val="single" w:sz="24" w:space="0" w:color="1B4D4B"/>
+          <w:top w:val="none"/>
+          <w:bottom w:val="none"/>
+          <w:right w:val="none"/>
+          <w:insideH w:val="none"/>
+          <w:insideV w:val="none"/>
+        </w:tblBorders>
       </w:tblPr>
       <w:tblGrid>
-        <w:gridCol w:w="4320"/>
-        <w:gridCol w:w="4320"/>
+        <w:gridCol w:w="9360"/>
       </w:tblGrid>
       <w:tr>
         <w:tc>
           <w:tcPr>
-            <w:tcW w:type="dxa" w:w="4320"/>
-            <w:shd w:val="clear" w:color="auto" w:fill="1B4D4B"/>
+            <w:tcW w:type="dxa" w:w="9360"/>
+            <w:shd w:val="clear" w:color="auto" w:fill="F8FAFC"/>
             <w:tcMar>
               <w:top w:w="120" w:type="dxa"/>
               <w:bottom w:w="120" w:type="dxa"/>
-              <w:left w:w="150" w:type="dxa"/>
-              <w:right w:w="150" w:type="dxa"/>
+              <w:left w:w="180" w:type="dxa"/>
+              <w:right w:w="180" w:type="dxa"/>
             </w:tcMar>
           </w:tcPr>
           <w:p>
             <w:pPr>
-              <w:jc w:val="left"/>
+              <w:spacing w:before="0" w:after="40"/>
             </w:pPr>
             <w:r>
               <w:rPr>
                 <w:rFonts w:ascii="Calibri" w:hAnsi="Calibri"/>
                 <w:b/>
-                <w:color w:val="FFFFFF"/>
+                <w:color w:val="1B4D4B"/>
                 <w:sz w:val="20"/>
               </w:rPr>
-              <w:t>Module Name</w:t>
+              <w:t>STATUTORY REGULATORY STANDARD (GST ACT 2017)</w:t>
+              <w:br/>
             </w:r>
-          </w:p>
-        </w:tc>
-        <w:tc>
-          <w:tcPr>
-            <w:tcW w:type="dxa" w:w="4320"/>
-            <w:shd w:val="clear" w:color="auto" w:fill="1B4D4B"/>
-            <w:tcMar>
-              <w:top w:w="120" w:type="dxa"/>
-              <w:bottom w:w="120" w:type="dxa"/>
-              <w:left w:w="150" w:type="dxa"/>
-              <w:right w:w="150" w:type="dxa"/>
-            </w:tcMar>
-          </w:tcPr>
-          <w:p>
-            <w:pPr>
-              <w:jc w:val="left"/>
-            </w:pPr>
             <w:r>
               <w:rPr>
                 <w:rFonts w:ascii="Calibri" w:hAnsi="Calibri"/>
-                <w:b/>
-                <w:color w:val="FFFFFF"/>
+                <w:i/>
+                <w:color w:val="1A202C"/>
                 <w:sz w:val="20"/>
               </w:rPr>
-              <w:t>Primary Responsibilities</w:t>
-            </w:r>
-          </w:p>
-        </w:tc>
-      </w:tr>
-      <w:tr>
-        <w:tc>
-          <w:tcPr>
-            <w:tcW w:type="dxa" w:w="4320"/>
-            <w:shd w:val="clear" w:color="auto" w:fill="FFFFFF"/>
-            <w:tcMar>
-              <w:top w:w="100" w:type="dxa"/>
-              <w:bottom w:w="100" w:type="dxa"/>
-              <w:left w:w="150" w:type="dxa"/>
-              <w:right w:w="150" w:type="dxa"/>
-            </w:tcMar>
-          </w:tcPr>
-          <w:p>
-            <w:pPr>
-              <w:jc w:val="left"/>
-            </w:pPr>
-            <w:r>
-              <w:rPr>
-                <w:rFonts w:ascii="Calibri" w:hAnsi="Calibri"/>
-                <w:color w:val="333333"/>
-                <w:sz w:val="19"/>
-              </w:rPr>
-              <w:t>Authentication &amp; Session Guard</w:t>
-            </w:r>
-          </w:p>
-        </w:tc>
-        <w:tc>
-          <w:tcPr>
-            <w:tcW w:type="dxa" w:w="4320"/>
-            <w:shd w:val="clear" w:color="auto" w:fill="FFFFFF"/>
-            <w:tcMar>
-              <w:top w:w="100" w:type="dxa"/>
-              <w:bottom w:w="100" w:type="dxa"/>
-              <w:left w:w="150" w:type="dxa"/>
-              <w:right w:w="150" w:type="dxa"/>
-            </w:tcMar>
-          </w:tcPr>
-          <w:p>
-            <w:pPr>
-              <w:jc w:val="left"/>
-            </w:pPr>
-            <w:r>
-              <w:rPr>
-                <w:rFonts w:ascii="Calibri" w:hAnsi="Calibri"/>
-                <w:color w:val="333333"/>
-                <w:sz w:val="19"/>
-              </w:rPr>
-              <w:t>User signup, credential verification, session retention in localStorage, and protected route guarding.</w:t>
-            </w:r>
-          </w:p>
-        </w:tc>
-      </w:tr>
-      <w:tr>
-        <w:tc>
-          <w:tcPr>
-            <w:tcW w:type="dxa" w:w="4320"/>
-            <w:shd w:val="clear" w:color="auto" w:fill="F4F6F6"/>
-            <w:tcMar>
-              <w:top w:w="100" w:type="dxa"/>
-              <w:bottom w:w="100" w:type="dxa"/>
-              <w:left w:w="150" w:type="dxa"/>
-              <w:right w:w="150" w:type="dxa"/>
-            </w:tcMar>
-          </w:tcPr>
-          <w:p>
-            <w:pPr>
-              <w:jc w:val="left"/>
-            </w:pPr>
-            <w:r>
-              <w:rPr>
-                <w:rFonts w:ascii="Calibri" w:hAnsi="Calibri"/>
-                <w:color w:val="333333"/>
-                <w:sz w:val="19"/>
-              </w:rPr>
-              <w:t>Enterprise Profile Module</w:t>
-            </w:r>
-          </w:p>
-        </w:tc>
-        <w:tc>
-          <w:tcPr>
-            <w:tcW w:type="dxa" w:w="4320"/>
-            <w:shd w:val="clear" w:color="auto" w:fill="F4F6F6"/>
-            <w:tcMar>
-              <w:top w:w="100" w:type="dxa"/>
-              <w:bottom w:w="100" w:type="dxa"/>
-              <w:left w:w="150" w:type="dxa"/>
-              <w:right w:w="150" w:type="dxa"/>
-            </w:tcMar>
-          </w:tcPr>
-          <w:p>
-            <w:pPr>
-              <w:jc w:val="left"/>
-            </w:pPr>
-            <w:r>
-              <w:rPr>
-                <w:rFonts w:ascii="Calibri" w:hAnsi="Calibri"/>
-                <w:color w:val="333333"/>
-                <w:sz w:val="19"/>
-              </w:rPr>
-              <w:t>Manage multiple business profiles, default tax rates, bank credentials, and base64 company logos.</w:t>
-            </w:r>
-          </w:p>
-        </w:tc>
-      </w:tr>
-      <w:tr>
-        <w:tc>
-          <w:tcPr>
-            <w:tcW w:type="dxa" w:w="4320"/>
-            <w:shd w:val="clear" w:color="auto" w:fill="FFFFFF"/>
-            <w:tcMar>
-              <w:top w:w="100" w:type="dxa"/>
-              <w:bottom w:w="100" w:type="dxa"/>
-              <w:left w:w="150" w:type="dxa"/>
-              <w:right w:w="150" w:type="dxa"/>
-            </w:tcMar>
-          </w:tcPr>
-          <w:p>
-            <w:pPr>
-              <w:jc w:val="left"/>
-            </w:pPr>
-            <w:r>
-              <w:rPr>
-                <w:rFonts w:ascii="Calibri" w:hAnsi="Calibri"/>
-                <w:color w:val="333333"/>
-                <w:sz w:val="19"/>
-              </w:rPr>
-              <w:t>Customer Management Module</w:t>
-            </w:r>
-          </w:p>
-        </w:tc>
-        <w:tc>
-          <w:tcPr>
-            <w:tcW w:type="dxa" w:w="4320"/>
-            <w:shd w:val="clear" w:color="auto" w:fill="FFFFFF"/>
-            <w:tcMar>
-              <w:top w:w="100" w:type="dxa"/>
-              <w:bottom w:w="100" w:type="dxa"/>
-              <w:left w:w="150" w:type="dxa"/>
-              <w:right w:w="150" w:type="dxa"/>
-            </w:tcMar>
-          </w:tcPr>
-          <w:p>
-            <w:pPr>
-              <w:jc w:val="left"/>
-            </w:pPr>
-            <w:r>
-              <w:rPr>
-                <w:rFonts w:ascii="Calibri" w:hAnsi="Calibri"/>
-                <w:color w:val="333333"/>
-                <w:sz w:val="19"/>
-              </w:rPr>
-              <w:t>Store client contact records, billing addresses, tax IDs, and transaction histories.</w:t>
-            </w:r>
-          </w:p>
-        </w:tc>
-      </w:tr>
-      <w:tr>
-        <w:tc>
-          <w:tcPr>
-            <w:tcW w:type="dxa" w:w="4320"/>
-            <w:shd w:val="clear" w:color="auto" w:fill="F4F6F6"/>
-            <w:tcMar>
-              <w:top w:w="100" w:type="dxa"/>
-              <w:bottom w:w="100" w:type="dxa"/>
-              <w:left w:w="150" w:type="dxa"/>
-              <w:right w:w="150" w:type="dxa"/>
-            </w:tcMar>
-          </w:tcPr>
-          <w:p>
-            <w:pPr>
-              <w:jc w:val="left"/>
-            </w:pPr>
-            <w:r>
-              <w:rPr>
-                <w:rFonts w:ascii="Calibri" w:hAnsi="Calibri"/>
-                <w:color w:val="333333"/>
-                <w:sz w:val="19"/>
-              </w:rPr>
-              <w:t>Invoice &amp; Estimate Builder</w:t>
-            </w:r>
-          </w:p>
-        </w:tc>
-        <w:tc>
-          <w:tcPr>
-            <w:tcW w:type="dxa" w:w="4320"/>
-            <w:shd w:val="clear" w:color="auto" w:fill="F4F6F6"/>
-            <w:tcMar>
-              <w:top w:w="100" w:type="dxa"/>
-              <w:bottom w:w="100" w:type="dxa"/>
-              <w:left w:w="150" w:type="dxa"/>
-              <w:right w:w="150" w:type="dxa"/>
-            </w:tcMar>
-          </w:tcPr>
-          <w:p>
-            <w:pPr>
-              <w:jc w:val="left"/>
-            </w:pPr>
-            <w:r>
-              <w:rPr>
-                <w:rFonts w:ascii="Calibri" w:hAnsi="Calibri"/>
-                <w:color w:val="333333"/>
-                <w:sz w:val="19"/>
-              </w:rPr>
-              <w:t>Dynamic line-item manipulation, item catalog autofill, discount engine, and canvas signature pad.</w:t>
-            </w:r>
-          </w:p>
-        </w:tc>
-      </w:tr>
-      <w:tr>
-        <w:tc>
-          <w:tcPr>
-            <w:tcW w:type="dxa" w:w="4320"/>
-            <w:shd w:val="clear" w:color="auto" w:fill="FFFFFF"/>
-            <w:tcMar>
-              <w:top w:w="100" w:type="dxa"/>
-              <w:bottom w:w="100" w:type="dxa"/>
-              <w:left w:w="150" w:type="dxa"/>
-              <w:right w:w="150" w:type="dxa"/>
-            </w:tcMar>
-          </w:tcPr>
-          <w:p>
-            <w:pPr>
-              <w:jc w:val="left"/>
-            </w:pPr>
-            <w:r>
-              <w:rPr>
-                <w:rFonts w:ascii="Calibri" w:hAnsi="Calibri"/>
-                <w:color w:val="333333"/>
-                <w:sz w:val="19"/>
-              </w:rPr>
-              <w:t>Calculation &amp; Tax Engine</w:t>
-            </w:r>
-          </w:p>
-        </w:tc>
-        <w:tc>
-          <w:tcPr>
-            <w:tcW w:type="dxa" w:w="4320"/>
-            <w:shd w:val="clear" w:color="auto" w:fill="FFFFFF"/>
-            <w:tcMar>
-              <w:top w:w="100" w:type="dxa"/>
-              <w:bottom w:w="100" w:type="dxa"/>
-              <w:left w:w="150" w:type="dxa"/>
-              <w:right w:w="150" w:type="dxa"/>
-            </w:tcMar>
-          </w:tcPr>
-          <w:p>
-            <w:pPr>
-              <w:jc w:val="left"/>
-            </w:pPr>
-            <w:r>
-              <w:rPr>
-                <w:rFonts w:ascii="Calibri" w:hAnsi="Calibri"/>
-                <w:color w:val="333333"/>
-                <w:sz w:val="19"/>
-              </w:rPr>
-              <w:t>Compute subtotals, intra-state (CGST 9% + SGST 9%) vs inter-state (IGST 18%) tax splits, extra shipping/handling, and auto round-off.</w:t>
-            </w:r>
-          </w:p>
-        </w:tc>
-      </w:tr>
-      <w:tr>
-        <w:tc>
-          <w:tcPr>
-            <w:tcW w:type="dxa" w:w="4320"/>
-            <w:shd w:val="clear" w:color="auto" w:fill="F4F6F6"/>
-            <w:tcMar>
-              <w:top w:w="100" w:type="dxa"/>
-              <w:bottom w:w="100" w:type="dxa"/>
-              <w:left w:w="150" w:type="dxa"/>
-              <w:right w:w="150" w:type="dxa"/>
-            </w:tcMar>
-          </w:tcPr>
-          <w:p>
-            <w:pPr>
-              <w:jc w:val="left"/>
-            </w:pPr>
-            <w:r>
-              <w:rPr>
-                <w:rFonts w:ascii="Calibri" w:hAnsi="Calibri"/>
-                <w:color w:val="333333"/>
-                <w:sz w:val="19"/>
-              </w:rPr>
-              <w:t>Payment &amp; Settlement Ledger</w:t>
-            </w:r>
-          </w:p>
-        </w:tc>
-        <w:tc>
-          <w:tcPr>
-            <w:tcW w:type="dxa" w:w="4320"/>
-            <w:shd w:val="clear" w:color="auto" w:fill="F4F6F6"/>
-            <w:tcMar>
-              <w:top w:w="100" w:type="dxa"/>
-              <w:bottom w:w="100" w:type="dxa"/>
-              <w:left w:w="150" w:type="dxa"/>
-              <w:right w:w="150" w:type="dxa"/>
-            </w:tcMar>
-          </w:tcPr>
-          <w:p>
-            <w:pPr>
-              <w:jc w:val="left"/>
-            </w:pPr>
-            <w:r>
-              <w:rPr>
-                <w:rFonts w:ascii="Calibri" w:hAnsi="Calibri"/>
-                <w:color w:val="333333"/>
-                <w:sz w:val="19"/>
-              </w:rPr>
-              <w:t>Maintain chronological payment installments, adjust remaining balance dues, and toggle invoice states (Unpaid, Partially Paid, Paid).</w:t>
-            </w:r>
-          </w:p>
-        </w:tc>
-      </w:tr>
-      <w:tr>
-        <w:tc>
-          <w:tcPr>
-            <w:tcW w:type="dxa" w:w="4320"/>
-            <w:shd w:val="clear" w:color="auto" w:fill="FFFFFF"/>
-            <w:tcMar>
-              <w:top w:w="100" w:type="dxa"/>
-              <w:bottom w:w="100" w:type="dxa"/>
-              <w:left w:w="150" w:type="dxa"/>
-              <w:right w:w="150" w:type="dxa"/>
-            </w:tcMar>
-          </w:tcPr>
-          <w:p>
-            <w:pPr>
-              <w:jc w:val="left"/>
-            </w:pPr>
-            <w:r>
-              <w:rPr>
-                <w:rFonts w:ascii="Calibri" w:hAnsi="Calibri"/>
-                <w:color w:val="333333"/>
-                <w:sz w:val="19"/>
-              </w:rPr>
-              <w:t>Export &amp; Dispatch Module</w:t>
-            </w:r>
-          </w:p>
-        </w:tc>
-        <w:tc>
-          <w:tcPr>
-            <w:tcW w:type="dxa" w:w="4320"/>
-            <w:shd w:val="clear" w:color="auto" w:fill="FFFFFF"/>
-            <w:tcMar>
-              <w:top w:w="100" w:type="dxa"/>
-              <w:bottom w:w="100" w:type="dxa"/>
-              <w:left w:w="150" w:type="dxa"/>
-              <w:right w:w="150" w:type="dxa"/>
-            </w:tcMar>
-          </w:tcPr>
-          <w:p>
-            <w:pPr>
-              <w:jc w:val="left"/>
-            </w:pPr>
-            <w:r>
-              <w:rPr>
-                <w:rFonts w:ascii="Calibri" w:hAnsi="Calibri"/>
-                <w:color w:val="333333"/>
-                <w:sz w:val="19"/>
-              </w:rPr>
-              <w:t>Client-side PDF generation via html2pdf.js, standard A4 thermal/sheet printing, and one-click WhatsApp/Email dispatch.</w:t>
-            </w:r>
-          </w:p>
-        </w:tc>
-      </w:tr>
-      <w:tr>
-        <w:tc>
-          <w:tcPr>
-            <w:tcW w:type="dxa" w:w="4320"/>
-            <w:shd w:val="clear" w:color="auto" w:fill="F4F6F6"/>
-            <w:tcMar>
-              <w:top w:w="100" w:type="dxa"/>
-              <w:bottom w:w="100" w:type="dxa"/>
-              <w:left w:w="150" w:type="dxa"/>
-              <w:right w:w="150" w:type="dxa"/>
-            </w:tcMar>
-          </w:tcPr>
-          <w:p>
-            <w:pPr>
-              <w:jc w:val="left"/>
-            </w:pPr>
-            <w:r>
-              <w:rPr>
-                <w:rFonts w:ascii="Calibri" w:hAnsi="Calibri"/>
-                <w:color w:val="333333"/>
-                <w:sz w:val="19"/>
-              </w:rPr>
-              <w:t>Dashboard &amp; Analytics</w:t>
-            </w:r>
-          </w:p>
-        </w:tc>
-        <w:tc>
-          <w:tcPr>
-            <w:tcW w:type="dxa" w:w="4320"/>
-            <w:shd w:val="clear" w:color="auto" w:fill="F4F6F6"/>
-            <w:tcMar>
-              <w:top w:w="100" w:type="dxa"/>
-              <w:bottom w:w="100" w:type="dxa"/>
-              <w:left w:w="150" w:type="dxa"/>
-              <w:right w:w="150" w:type="dxa"/>
-            </w:tcMar>
-          </w:tcPr>
-          <w:p>
-            <w:pPr>
-              <w:jc w:val="left"/>
-            </w:pPr>
-            <w:r>
-              <w:rPr>
-                <w:rFonts w:ascii="Calibri" w:hAnsi="Calibri"/>
-                <w:color w:val="333333"/>
-                <w:sz w:val="19"/>
-              </w:rPr>
-              <w:t>Financial KPI cards (Total Billed, Collected, Balance Due, Overdue Count), receivables aging, and 6-month revenue SVG charts.</w:t>
+              <w:t>Statutory Indian Invoicing Requirement: Under Rule 46 of the CGST Rules 2017, every tax invoice issued by a registered supplier must contain consecutive serial numbers, GSTIN of supplier and recipient, HSN/SAC codes, state of supply, and clear tax breakouts.</w:t>
             </w:r>
           </w:p>
         </w:tc>
@@ -1500,67 +1650,134 @@
     <w:p>
       <w:pPr>
         <w:pStyle w:val="Heading2"/>
+        <w:spacing w:before="200" w:after="60"/>
       </w:pPr>
       <w:r>
         <w:rPr>
           <w:rFonts w:ascii="Calibri" w:hAnsi="Calibri"/>
           <w:b/>
           <w:color w:val="2C3E50"/>
-          <w:sz w:val="26"/>
+          <w:sz w:val="25"/>
         </w:rPr>
-        <w:t>7. Assumptions &amp; Constraints</w:t>
-      </w:r>
-    </w:p>
-    <w:p>
-      <w:r>
-        <w:t>Assumptions:</w:t>
-        <w:br/>
-        <w:t>• Users access the application via a modern ECMAScript 6+ compatible web browser (Chrome, Edge, Firefox, Safari).</w:t>
-        <w:br/>
-        <w:t>• The client machine supports localStorage with at least 5MB quota available.</w:t>
-        <w:br/>
-        <w:t>Constraints:</w:t>
-        <w:br/>
-        <w:t>• Offline persistence is scoped to the local browser profile unless the user exports data backups.</w:t>
-        <w:br/>
-        <w:t>• Real-time payment verification depends on external payment gateways or manual merchant acknowledgement.</w:t>
+        <w:t>4. Proposed Solution: Ledgerly Invoicing Engine</w:t>
       </w:r>
     </w:p>
     <w:p>
       <w:pPr>
-        <w:pStyle w:val="Heading2"/>
+        <w:spacing w:before="0" w:after="90" w:line="276" w:lineRule="auto"/>
+      </w:pPr>
+      <w:r>
+        <w:rPr>
+          <w:rFonts w:ascii="Calibri" w:hAnsi="Calibri"/>
+          <w:color w:val="1A202C"/>
+          <w:sz w:val="21"/>
+        </w:rPr>
+        <w:t>Ledgerly is conceptualized as an ultra-fast, zero-friction, offline-first Progressive Web Application (PWA). It executes entirely within the client's browser using pure HTML5, modern CSS3 design tokens, and Vanilla ECMAScript 2022.</w:t>
+      </w:r>
+    </w:p>
+    <w:p>
+      <w:pPr>
+        <w:spacing w:before="0" w:after="90" w:line="276" w:lineRule="auto"/>
+      </w:pPr>
+      <w:r>
+        <w:rPr>
+          <w:rFonts w:ascii="Calibri" w:hAnsi="Calibri"/>
+          <w:color w:val="1A202C"/>
+          <w:sz w:val="21"/>
+        </w:rPr>
+        <w:t>Core Architectural Pillars:</w:t>
+      </w:r>
+    </w:p>
+    <w:p>
+      <w:pPr>
+        <w:pStyle w:val="ListBullet"/>
+        <w:spacing w:before="0" w:after="50" w:line="276" w:lineRule="auto"/>
       </w:pPr>
       <w:r>
         <w:rPr>
           <w:rFonts w:ascii="Calibri" w:hAnsi="Calibri"/>
           <w:b/>
-          <w:color w:val="2C3E50"/>
-          <w:sz w:val="26"/>
+          <w:color w:val="1A202C"/>
+          <w:sz w:val="21"/>
         </w:rPr>
-        <w:t>8. Feasibility Analysis</w:t>
+        <w:t xml:space="preserve">Data Sovereignty: </w:t>
       </w:r>
-    </w:p>
-    <w:p>
       <w:r>
-        <w:t>• Technical Feasibility: Built entirely using standard HTML5, CSS3, Vanilla JavaScript, and Service Workers. Requires zero proprietary server dependencies.</w:t>
-        <w:br/>
-        <w:t>• Operational Feasibility: Extremely intuitive Single-Page Application (SPA) with zero installation hurdles. Runs instantly from file or web host.</w:t>
-        <w:br/>
-        <w:t>• Economic Feasibility: 100% open-source development stack with zero software licensing or recurring database server hosting expenses.</w:t>
+        <w:rPr>
+          <w:rFonts w:ascii="Calibri" w:hAnsi="Calibri"/>
+          <w:color w:val="1A202C"/>
+          <w:sz w:val="21"/>
+        </w:rPr>
+        <w:t>Zero Server Latency &amp; Total Privacy: All customer catalogs, invoices, and accounting entries reside in local browser storage, ensuring absolute confidentiality without cloud vulnerability.</w:t>
       </w:r>
     </w:p>
     <w:p>
       <w:pPr>
-        <w:pStyle w:val="Heading2"/>
+        <w:pStyle w:val="ListBullet"/>
+        <w:spacing w:before="0" w:after="50" w:line="276" w:lineRule="auto"/>
       </w:pPr>
       <w:r>
         <w:rPr>
           <w:rFonts w:ascii="Calibri" w:hAnsi="Calibri"/>
           <w:b/>
-          <w:color w:val="2C3E50"/>
-          <w:sz w:val="26"/>
+          <w:color w:val="1A202C"/>
+          <w:sz w:val="21"/>
         </w:rPr>
-        <w:t>9. High-Level Concept Map</w:t>
+        <w:t xml:space="preserve">Statutory Accuracy: </w:t>
+      </w:r>
+      <w:r>
+        <w:rPr>
+          <w:rFonts w:ascii="Calibri" w:hAnsi="Calibri"/>
+          <w:color w:val="1A202C"/>
+          <w:sz w:val="21"/>
+        </w:rPr>
+        <w:t>Full GST &amp; HSN Compliance: Dynamic calculation of intra-state (CGST + SGST) and inter-state (IGST) tax schedules, HSN tax summary matrices, and automatic number-to-words currency rendering.</w:t>
+      </w:r>
+    </w:p>
+    <w:p>
+      <w:pPr>
+        <w:pStyle w:val="ListBullet"/>
+        <w:spacing w:before="0" w:after="50" w:line="276" w:lineRule="auto"/>
+      </w:pPr>
+      <w:r>
+        <w:rPr>
+          <w:rFonts w:ascii="Calibri" w:hAnsi="Calibri"/>
+          <w:b/>
+          <w:color w:val="1A202C"/>
+          <w:sz w:val="21"/>
+        </w:rPr>
+        <w:t xml:space="preserve">Settlement Acceleration: </w:t>
+      </w:r>
+      <w:r>
+        <w:rPr>
+          <w:rFonts w:ascii="Calibri" w:hAnsi="Calibri"/>
+          <w:color w:val="1A202C"/>
+          <w:sz w:val="21"/>
+        </w:rPr>
+        <w:t>Instant UPI &amp; Canvas Signature: Built-in base64 canvas signature pad and synchronous offline QR code generator for instant BharatPe / GooglePay / PhonePe settlements.</w:t>
+      </w:r>
+    </w:p>
+    <w:p>
+      <w:pPr>
+        <w:pStyle w:val="ListBullet"/>
+        <w:spacing w:before="0" w:after="50" w:line="276" w:lineRule="auto"/>
+      </w:pPr>
+      <w:r>
+        <w:rPr>
+          <w:rFonts w:ascii="Calibri" w:hAnsi="Calibri"/>
+          <w:b/>
+          <w:color w:val="1A202C"/>
+          <w:sz w:val="21"/>
+        </w:rPr>
+        <w:t xml:space="preserve">Direct Document Export: </w:t>
+      </w:r>
+      <w:r>
+        <w:rPr>
+          <w:rFonts w:ascii="Calibri" w:hAnsi="Calibri"/>
+          <w:color w:val="1A202C"/>
+          <w:sz w:val="21"/>
+        </w:rPr>
+        <w:t>High-Fidelity PDF Generation: Single-click client-rendered PDF synthesis calibrated for international A4 dimensions without server round-trips.</w:t>
       </w:r>
     </w:p>
     <w:p>
@@ -1586,7 +1803,7 @@
                     <pic:cNvPicPr/>
                   </pic:nvPicPr>
                   <pic:blipFill>
-                    <a:blip r:embed="rId9"/>
+                    <a:blip r:embed="rId11"/>
                     <a:stretch>
                       <a:fillRect/>
                     </a:stretch>
@@ -1613,40 +1830,2016 @@
         <w:rPr>
           <w:rFonts w:ascii="Calibri" w:hAnsi="Calibri"/>
           <w:i/>
-          <w:color w:val="666666"/>
+          <w:color w:val="718096"/>
           <w:sz w:val="18"/>
         </w:rPr>
-        <w:t>Figure: Ledgerly High-Level System Architecture and Runtime Blueprint</w:t>
+        <w:t>Figure: Ledgerly High-Level System Architecture &amp; Offline Storage Boundary</w:t>
       </w:r>
     </w:p>
     <w:p/>
     <w:p>
       <w:pPr>
         <w:pStyle w:val="Heading2"/>
+        <w:spacing w:before="200" w:after="60"/>
       </w:pPr>
       <w:r>
         <w:rPr>
           <w:rFonts w:ascii="Calibri" w:hAnsi="Calibri"/>
           <w:b/>
           <w:color w:val="2C3E50"/>
-          <w:sz w:val="26"/>
+          <w:sz w:val="25"/>
         </w:rPr>
-        <w:t>10. Conclusion</w:t>
+        <w:t>5. Feasibility Study</w:t>
+      </w:r>
+    </w:p>
+    <w:tbl>
+      <w:tblPr>
+        <w:tblW w:type="auto" w:w="0"/>
+        <w:jc w:val="center"/>
+        <w:tblLayout w:type="fixed"/>
+        <w:tblLook w:firstColumn="1" w:firstRow="1" w:lastColumn="0" w:lastRow="0" w:noHBand="0" w:noVBand="1" w:val="04A0"/>
+        <w:tblBorders>
+          <w:top w:val="single" w:sz="4" w:space="0" w:color="D1D5DB"/>
+          <w:left w:val="single" w:sz="4" w:space="0" w:color="D1D5DB"/>
+          <w:bottom w:val="single" w:sz="4" w:space="0" w:color="D1D5DB"/>
+          <w:right w:val="single" w:sz="4" w:space="0" w:color="D1D5DB"/>
+          <w:insideH w:val="single" w:sz="4" w:space="0" w:color="D1D5DB"/>
+          <w:insideV w:val="single" w:sz="4" w:space="0" w:color="D1D5DB"/>
+        </w:tblBorders>
+      </w:tblPr>
+      <w:tblGrid>
+        <w:gridCol w:w="3120"/>
+        <w:gridCol w:w="3120"/>
+        <w:gridCol w:w="3120"/>
+      </w:tblGrid>
+      <w:tr>
+        <w:tc>
+          <w:tcPr>
+            <w:tcW w:type="dxa" w:w="2592"/>
+            <w:shd w:val="clear" w:color="auto" w:fill="1B4D4B"/>
+            <w:tcMar>
+              <w:top w:w="120" w:type="dxa"/>
+              <w:bottom w:w="120" w:type="dxa"/>
+              <w:left w:w="140" w:type="dxa"/>
+              <w:right w:w="140" w:type="dxa"/>
+            </w:tcMar>
+          </w:tcPr>
+          <w:p>
+            <w:pPr>
+              <w:spacing w:before="0" w:after="0"/>
+              <w:jc w:val="left"/>
+            </w:pPr>
+            <w:r>
+              <w:rPr>
+                <w:rFonts w:ascii="Calibri" w:hAnsi="Calibri"/>
+                <w:b/>
+                <w:color w:val="FFFFFF"/>
+                <w:sz w:val="20"/>
+              </w:rPr>
+              <w:t>Feasibility Dimension</w:t>
+            </w:r>
+          </w:p>
+        </w:tc>
+        <w:tc>
+          <w:tcPr>
+            <w:tcW w:type="dxa" w:w="1440"/>
+            <w:shd w:val="clear" w:color="auto" w:fill="1B4D4B"/>
+            <w:tcMar>
+              <w:top w:w="120" w:type="dxa"/>
+              <w:bottom w:w="120" w:type="dxa"/>
+              <w:left w:w="140" w:type="dxa"/>
+              <w:right w:w="140" w:type="dxa"/>
+            </w:tcMar>
+          </w:tcPr>
+          <w:p>
+            <w:pPr>
+              <w:spacing w:before="0" w:after="0"/>
+              <w:jc w:val="left"/>
+            </w:pPr>
+            <w:r>
+              <w:rPr>
+                <w:rFonts w:ascii="Calibri" w:hAnsi="Calibri"/>
+                <w:b/>
+                <w:color w:val="FFFFFF"/>
+                <w:sz w:val="20"/>
+              </w:rPr>
+              <w:t>Rating</w:t>
+            </w:r>
+          </w:p>
+        </w:tc>
+        <w:tc>
+          <w:tcPr>
+            <w:tcW w:type="dxa" w:w="5328"/>
+            <w:shd w:val="clear" w:color="auto" w:fill="1B4D4B"/>
+            <w:tcMar>
+              <w:top w:w="120" w:type="dxa"/>
+              <w:bottom w:w="120" w:type="dxa"/>
+              <w:left w:w="140" w:type="dxa"/>
+              <w:right w:w="140" w:type="dxa"/>
+            </w:tcMar>
+          </w:tcPr>
+          <w:p>
+            <w:pPr>
+              <w:spacing w:before="0" w:after="0"/>
+              <w:jc w:val="left"/>
+            </w:pPr>
+            <w:r>
+              <w:rPr>
+                <w:rFonts w:ascii="Calibri" w:hAnsi="Calibri"/>
+                <w:b/>
+                <w:color w:val="FFFFFF"/>
+                <w:sz w:val="20"/>
+              </w:rPr>
+              <w:t>Engineering Justification</w:t>
+            </w:r>
+          </w:p>
+        </w:tc>
+      </w:tr>
+      <w:tr>
+        <w:tc>
+          <w:tcPr>
+            <w:tcW w:type="dxa" w:w="2592"/>
+            <w:shd w:val="clear" w:color="auto" w:fill="FFFFFF"/>
+            <w:tcMar>
+              <w:top w:w="100" w:type="dxa"/>
+              <w:bottom w:w="100" w:type="dxa"/>
+              <w:left w:w="140" w:type="dxa"/>
+              <w:right w:w="140" w:type="dxa"/>
+            </w:tcMar>
+          </w:tcPr>
+          <w:p>
+            <w:pPr>
+              <w:spacing w:before="0" w:after="0" w:line="276" w:lineRule="auto"/>
+              <w:jc w:val="left"/>
+            </w:pPr>
+            <w:r>
+              <w:rPr>
+                <w:rFonts w:ascii="Calibri" w:hAnsi="Calibri"/>
+                <w:color w:val="1A202C"/>
+                <w:sz w:val="19"/>
+              </w:rPr>
+              <w:t>Technical Feasibility</w:t>
+            </w:r>
+          </w:p>
+        </w:tc>
+        <w:tc>
+          <w:tcPr>
+            <w:tcW w:type="dxa" w:w="1440"/>
+            <w:shd w:val="clear" w:color="auto" w:fill="FFFFFF"/>
+            <w:tcMar>
+              <w:top w:w="100" w:type="dxa"/>
+              <w:bottom w:w="100" w:type="dxa"/>
+              <w:left w:w="140" w:type="dxa"/>
+              <w:right w:w="140" w:type="dxa"/>
+            </w:tcMar>
+          </w:tcPr>
+          <w:p>
+            <w:pPr>
+              <w:spacing w:before="0" w:after="0" w:line="276" w:lineRule="auto"/>
+              <w:jc w:val="left"/>
+            </w:pPr>
+            <w:r>
+              <w:rPr>
+                <w:rFonts w:ascii="Calibri" w:hAnsi="Calibri"/>
+                <w:color w:val="1A202C"/>
+                <w:sz w:val="19"/>
+              </w:rPr>
+              <w:t>High</w:t>
+            </w:r>
+          </w:p>
+        </w:tc>
+        <w:tc>
+          <w:tcPr>
+            <w:tcW w:type="dxa" w:w="5328"/>
+            <w:shd w:val="clear" w:color="auto" w:fill="FFFFFF"/>
+            <w:tcMar>
+              <w:top w:w="100" w:type="dxa"/>
+              <w:bottom w:w="100" w:type="dxa"/>
+              <w:left w:w="140" w:type="dxa"/>
+              <w:right w:w="140" w:type="dxa"/>
+            </w:tcMar>
+          </w:tcPr>
+          <w:p>
+            <w:pPr>
+              <w:spacing w:before="0" w:after="0" w:line="276" w:lineRule="auto"/>
+              <w:jc w:val="left"/>
+            </w:pPr>
+            <w:r>
+              <w:rPr>
+                <w:rFonts w:ascii="Calibri" w:hAnsi="Calibri"/>
+                <w:color w:val="1A202C"/>
+                <w:sz w:val="19"/>
+              </w:rPr>
+              <w:t>Standard modern browser APIs (HTML5 Canvas, Service Worker, localStorage, Blob URLs) are supported across 98.5% of active global devices without external runtimes.</w:t>
+            </w:r>
+          </w:p>
+        </w:tc>
+      </w:tr>
+      <w:tr>
+        <w:tc>
+          <w:tcPr>
+            <w:tcW w:type="dxa" w:w="2592"/>
+            <w:shd w:val="clear" w:color="auto" w:fill="F7FAFC"/>
+            <w:tcMar>
+              <w:top w:w="100" w:type="dxa"/>
+              <w:bottom w:w="100" w:type="dxa"/>
+              <w:left w:w="140" w:type="dxa"/>
+              <w:right w:w="140" w:type="dxa"/>
+            </w:tcMar>
+          </w:tcPr>
+          <w:p>
+            <w:pPr>
+              <w:spacing w:before="0" w:after="0" w:line="276" w:lineRule="auto"/>
+              <w:jc w:val="left"/>
+            </w:pPr>
+            <w:r>
+              <w:rPr>
+                <w:rFonts w:ascii="Calibri" w:hAnsi="Calibri"/>
+                <w:color w:val="1A202C"/>
+                <w:sz w:val="19"/>
+              </w:rPr>
+              <w:t>Operational Feasibility</w:t>
+            </w:r>
+          </w:p>
+        </w:tc>
+        <w:tc>
+          <w:tcPr>
+            <w:tcW w:type="dxa" w:w="1440"/>
+            <w:shd w:val="clear" w:color="auto" w:fill="F7FAFC"/>
+            <w:tcMar>
+              <w:top w:w="100" w:type="dxa"/>
+              <w:bottom w:w="100" w:type="dxa"/>
+              <w:left w:w="140" w:type="dxa"/>
+              <w:right w:w="140" w:type="dxa"/>
+            </w:tcMar>
+          </w:tcPr>
+          <w:p>
+            <w:pPr>
+              <w:spacing w:before="0" w:after="0" w:line="276" w:lineRule="auto"/>
+              <w:jc w:val="left"/>
+            </w:pPr>
+            <w:r>
+              <w:rPr>
+                <w:rFonts w:ascii="Calibri" w:hAnsi="Calibri"/>
+                <w:color w:val="1A202C"/>
+                <w:sz w:val="19"/>
+              </w:rPr>
+              <w:t>Very High</w:t>
+            </w:r>
+          </w:p>
+        </w:tc>
+        <w:tc>
+          <w:tcPr>
+            <w:tcW w:type="dxa" w:w="5328"/>
+            <w:shd w:val="clear" w:color="auto" w:fill="F7FAFC"/>
+            <w:tcMar>
+              <w:top w:w="100" w:type="dxa"/>
+              <w:bottom w:w="100" w:type="dxa"/>
+              <w:left w:w="140" w:type="dxa"/>
+              <w:right w:w="140" w:type="dxa"/>
+            </w:tcMar>
+          </w:tcPr>
+          <w:p>
+            <w:pPr>
+              <w:spacing w:before="0" w:after="0" w:line="276" w:lineRule="auto"/>
+              <w:jc w:val="left"/>
+            </w:pPr>
+            <w:r>
+              <w:rPr>
+                <w:rFonts w:ascii="Calibri" w:hAnsi="Calibri"/>
+                <w:color w:val="1A202C"/>
+                <w:sz w:val="19"/>
+              </w:rPr>
+              <w:t>Single-page responsive workflow requires zero installation, zero user account setup on remote servers, and minimal training for non-technical users.</w:t>
+            </w:r>
+          </w:p>
+        </w:tc>
+      </w:tr>
+      <w:tr>
+        <w:tc>
+          <w:tcPr>
+            <w:tcW w:type="dxa" w:w="2592"/>
+            <w:shd w:val="clear" w:color="auto" w:fill="FFFFFF"/>
+            <w:tcMar>
+              <w:top w:w="100" w:type="dxa"/>
+              <w:bottom w:w="100" w:type="dxa"/>
+              <w:left w:w="140" w:type="dxa"/>
+              <w:right w:w="140" w:type="dxa"/>
+            </w:tcMar>
+          </w:tcPr>
+          <w:p>
+            <w:pPr>
+              <w:spacing w:before="0" w:after="0" w:line="276" w:lineRule="auto"/>
+              <w:jc w:val="left"/>
+            </w:pPr>
+            <w:r>
+              <w:rPr>
+                <w:rFonts w:ascii="Calibri" w:hAnsi="Calibri"/>
+                <w:color w:val="1A202C"/>
+                <w:sz w:val="19"/>
+              </w:rPr>
+              <w:t>Economic Feasibility</w:t>
+            </w:r>
+          </w:p>
+        </w:tc>
+        <w:tc>
+          <w:tcPr>
+            <w:tcW w:type="dxa" w:w="1440"/>
+            <w:shd w:val="clear" w:color="auto" w:fill="FFFFFF"/>
+            <w:tcMar>
+              <w:top w:w="100" w:type="dxa"/>
+              <w:bottom w:w="100" w:type="dxa"/>
+              <w:left w:w="140" w:type="dxa"/>
+              <w:right w:w="140" w:type="dxa"/>
+            </w:tcMar>
+          </w:tcPr>
+          <w:p>
+            <w:pPr>
+              <w:spacing w:before="0" w:after="0" w:line="276" w:lineRule="auto"/>
+              <w:jc w:val="left"/>
+            </w:pPr>
+            <w:r>
+              <w:rPr>
+                <w:rFonts w:ascii="Calibri" w:hAnsi="Calibri"/>
+                <w:color w:val="1A202C"/>
+                <w:sz w:val="19"/>
+              </w:rPr>
+              <w:t>Exceptional</w:t>
+            </w:r>
+          </w:p>
+        </w:tc>
+        <w:tc>
+          <w:tcPr>
+            <w:tcW w:type="dxa" w:w="5328"/>
+            <w:shd w:val="clear" w:color="auto" w:fill="FFFFFF"/>
+            <w:tcMar>
+              <w:top w:w="100" w:type="dxa"/>
+              <w:bottom w:w="100" w:type="dxa"/>
+              <w:left w:w="140" w:type="dxa"/>
+              <w:right w:w="140" w:type="dxa"/>
+            </w:tcMar>
+          </w:tcPr>
+          <w:p>
+            <w:pPr>
+              <w:spacing w:before="0" w:after="0" w:line="276" w:lineRule="auto"/>
+              <w:jc w:val="left"/>
+            </w:pPr>
+            <w:r>
+              <w:rPr>
+                <w:rFonts w:ascii="Calibri" w:hAnsi="Calibri"/>
+                <w:color w:val="1A202C"/>
+                <w:sz w:val="19"/>
+              </w:rPr>
+              <w:t>Zero monthly cloud server hosting bills, zero database licensing fees, and minimal operational maintenance overhead.</w:t>
+            </w:r>
+          </w:p>
+        </w:tc>
+      </w:tr>
+      <w:tr>
+        <w:tc>
+          <w:tcPr>
+            <w:tcW w:type="dxa" w:w="2592"/>
+            <w:shd w:val="clear" w:color="auto" w:fill="F7FAFC"/>
+            <w:tcMar>
+              <w:top w:w="100" w:type="dxa"/>
+              <w:bottom w:w="100" w:type="dxa"/>
+              <w:left w:w="140" w:type="dxa"/>
+              <w:right w:w="140" w:type="dxa"/>
+            </w:tcMar>
+          </w:tcPr>
+          <w:p>
+            <w:pPr>
+              <w:spacing w:before="0" w:after="0" w:line="276" w:lineRule="auto"/>
+              <w:jc w:val="left"/>
+            </w:pPr>
+            <w:r>
+              <w:rPr>
+                <w:rFonts w:ascii="Calibri" w:hAnsi="Calibri"/>
+                <w:color w:val="1A202C"/>
+                <w:sz w:val="19"/>
+              </w:rPr>
+              <w:t>Schedule Feasibility</w:t>
+            </w:r>
+          </w:p>
+        </w:tc>
+        <w:tc>
+          <w:tcPr>
+            <w:tcW w:type="dxa" w:w="1440"/>
+            <w:shd w:val="clear" w:color="auto" w:fill="F7FAFC"/>
+            <w:tcMar>
+              <w:top w:w="100" w:type="dxa"/>
+              <w:bottom w:w="100" w:type="dxa"/>
+              <w:left w:w="140" w:type="dxa"/>
+              <w:right w:w="140" w:type="dxa"/>
+            </w:tcMar>
+          </w:tcPr>
+          <w:p>
+            <w:pPr>
+              <w:spacing w:before="0" w:after="0" w:line="276" w:lineRule="auto"/>
+              <w:jc w:val="left"/>
+            </w:pPr>
+            <w:r>
+              <w:rPr>
+                <w:rFonts w:ascii="Calibri" w:hAnsi="Calibri"/>
+                <w:color w:val="1A202C"/>
+                <w:sz w:val="19"/>
+              </w:rPr>
+              <w:t>High</w:t>
+            </w:r>
+          </w:p>
+        </w:tc>
+        <w:tc>
+          <w:tcPr>
+            <w:tcW w:type="dxa" w:w="5328"/>
+            <w:shd w:val="clear" w:color="auto" w:fill="F7FAFC"/>
+            <w:tcMar>
+              <w:top w:w="100" w:type="dxa"/>
+              <w:bottom w:w="100" w:type="dxa"/>
+              <w:left w:w="140" w:type="dxa"/>
+              <w:right w:w="140" w:type="dxa"/>
+            </w:tcMar>
+          </w:tcPr>
+          <w:p>
+            <w:pPr>
+              <w:spacing w:before="0" w:after="0" w:line="276" w:lineRule="auto"/>
+              <w:jc w:val="left"/>
+            </w:pPr>
+            <w:r>
+              <w:rPr>
+                <w:rFonts w:ascii="Calibri" w:hAnsi="Calibri"/>
+                <w:color w:val="1A202C"/>
+                <w:sz w:val="19"/>
+              </w:rPr>
+              <w:t>Modular Agile delivery across 13 sprint milestones achievable within a standard 16-week semester schedule.</w:t>
+            </w:r>
+          </w:p>
+        </w:tc>
+      </w:tr>
+    </w:tbl>
+    <w:p/>
+    <w:p>
+      <w:pPr>
+        <w:pStyle w:val="Heading2"/>
+        <w:spacing w:before="200" w:after="60"/>
+      </w:pPr>
+      <w:r>
+        <w:rPr>
+          <w:rFonts w:ascii="Calibri" w:hAnsi="Calibri"/>
+          <w:b/>
+          <w:color w:val="2C3E50"/>
+          <w:sz w:val="25"/>
+        </w:rPr>
+        <w:t>6. Stakeholder Matrix &amp; Target Personas</w:t>
+      </w:r>
+    </w:p>
+    <w:tbl>
+      <w:tblPr>
+        <w:tblW w:type="auto" w:w="0"/>
+        <w:jc w:val="center"/>
+        <w:tblLayout w:type="fixed"/>
+        <w:tblLook w:firstColumn="1" w:firstRow="1" w:lastColumn="0" w:lastRow="0" w:noHBand="0" w:noVBand="1" w:val="04A0"/>
+        <w:tblBorders>
+          <w:top w:val="single" w:sz="4" w:space="0" w:color="D1D5DB"/>
+          <w:left w:val="single" w:sz="4" w:space="0" w:color="D1D5DB"/>
+          <w:bottom w:val="single" w:sz="4" w:space="0" w:color="D1D5DB"/>
+          <w:right w:val="single" w:sz="4" w:space="0" w:color="D1D5DB"/>
+          <w:insideH w:val="single" w:sz="4" w:space="0" w:color="D1D5DB"/>
+          <w:insideV w:val="single" w:sz="4" w:space="0" w:color="D1D5DB"/>
+        </w:tblBorders>
+      </w:tblPr>
+      <w:tblGrid>
+        <w:gridCol w:w="3120"/>
+        <w:gridCol w:w="3120"/>
+        <w:gridCol w:w="3120"/>
+      </w:tblGrid>
+      <w:tr>
+        <w:tc>
+          <w:tcPr>
+            <w:tcW w:type="dxa" w:w="2592"/>
+            <w:shd w:val="clear" w:color="auto" w:fill="1B4D4B"/>
+            <w:tcMar>
+              <w:top w:w="120" w:type="dxa"/>
+              <w:bottom w:w="120" w:type="dxa"/>
+              <w:left w:w="140" w:type="dxa"/>
+              <w:right w:w="140" w:type="dxa"/>
+            </w:tcMar>
+          </w:tcPr>
+          <w:p>
+            <w:pPr>
+              <w:spacing w:before="0" w:after="0"/>
+              <w:jc w:val="left"/>
+            </w:pPr>
+            <w:r>
+              <w:rPr>
+                <w:rFonts w:ascii="Calibri" w:hAnsi="Calibri"/>
+                <w:b/>
+                <w:color w:val="FFFFFF"/>
+                <w:sz w:val="20"/>
+              </w:rPr>
+              <w:t>Stakeholder Role</w:t>
+            </w:r>
+          </w:p>
+        </w:tc>
+        <w:tc>
+          <w:tcPr>
+            <w:tcW w:type="dxa" w:w="2016"/>
+            <w:shd w:val="clear" w:color="auto" w:fill="1B4D4B"/>
+            <w:tcMar>
+              <w:top w:w="120" w:type="dxa"/>
+              <w:bottom w:w="120" w:type="dxa"/>
+              <w:left w:w="140" w:type="dxa"/>
+              <w:right w:w="140" w:type="dxa"/>
+            </w:tcMar>
+          </w:tcPr>
+          <w:p>
+            <w:pPr>
+              <w:spacing w:before="0" w:after="0"/>
+              <w:jc w:val="left"/>
+            </w:pPr>
+            <w:r>
+              <w:rPr>
+                <w:rFonts w:ascii="Calibri" w:hAnsi="Calibri"/>
+                <w:b/>
+                <w:color w:val="FFFFFF"/>
+                <w:sz w:val="20"/>
+              </w:rPr>
+              <w:t>Classification</w:t>
+            </w:r>
+          </w:p>
+        </w:tc>
+        <w:tc>
+          <w:tcPr>
+            <w:tcW w:type="dxa" w:w="4752"/>
+            <w:shd w:val="clear" w:color="auto" w:fill="1B4D4B"/>
+            <w:tcMar>
+              <w:top w:w="120" w:type="dxa"/>
+              <w:bottom w:w="120" w:type="dxa"/>
+              <w:left w:w="140" w:type="dxa"/>
+              <w:right w:w="140" w:type="dxa"/>
+            </w:tcMar>
+          </w:tcPr>
+          <w:p>
+            <w:pPr>
+              <w:spacing w:before="0" w:after="0"/>
+              <w:jc w:val="left"/>
+            </w:pPr>
+            <w:r>
+              <w:rPr>
+                <w:rFonts w:ascii="Calibri" w:hAnsi="Calibri"/>
+                <w:b/>
+                <w:color w:val="FFFFFF"/>
+                <w:sz w:val="20"/>
+              </w:rPr>
+              <w:t>Key System Requirements</w:t>
+            </w:r>
+          </w:p>
+        </w:tc>
+      </w:tr>
+      <w:tr>
+        <w:tc>
+          <w:tcPr>
+            <w:tcW w:type="dxa" w:w="2592"/>
+            <w:shd w:val="clear" w:color="auto" w:fill="FFFFFF"/>
+            <w:tcMar>
+              <w:top w:w="100" w:type="dxa"/>
+              <w:bottom w:w="100" w:type="dxa"/>
+              <w:left w:w="140" w:type="dxa"/>
+              <w:right w:w="140" w:type="dxa"/>
+            </w:tcMar>
+          </w:tcPr>
+          <w:p>
+            <w:pPr>
+              <w:spacing w:before="0" w:after="0" w:line="276" w:lineRule="auto"/>
+              <w:jc w:val="left"/>
+            </w:pPr>
+            <w:r>
+              <w:rPr>
+                <w:rFonts w:ascii="Calibri" w:hAnsi="Calibri"/>
+                <w:color w:val="1A202C"/>
+                <w:sz w:val="19"/>
+              </w:rPr>
+              <w:t>Freelance Designer / Developer</w:t>
+            </w:r>
+          </w:p>
+        </w:tc>
+        <w:tc>
+          <w:tcPr>
+            <w:tcW w:type="dxa" w:w="2016"/>
+            <w:shd w:val="clear" w:color="auto" w:fill="FFFFFF"/>
+            <w:tcMar>
+              <w:top w:w="100" w:type="dxa"/>
+              <w:bottom w:w="100" w:type="dxa"/>
+              <w:left w:w="140" w:type="dxa"/>
+              <w:right w:w="140" w:type="dxa"/>
+            </w:tcMar>
+          </w:tcPr>
+          <w:p>
+            <w:pPr>
+              <w:spacing w:before="0" w:after="0" w:line="276" w:lineRule="auto"/>
+              <w:jc w:val="left"/>
+            </w:pPr>
+            <w:r>
+              <w:rPr>
+                <w:rFonts w:ascii="Calibri" w:hAnsi="Calibri"/>
+                <w:color w:val="1A202C"/>
+                <w:sz w:val="19"/>
+              </w:rPr>
+              <w:t>Sole Practitioner</w:t>
+            </w:r>
+          </w:p>
+        </w:tc>
+        <w:tc>
+          <w:tcPr>
+            <w:tcW w:type="dxa" w:w="4752"/>
+            <w:shd w:val="clear" w:color="auto" w:fill="FFFFFF"/>
+            <w:tcMar>
+              <w:top w:w="100" w:type="dxa"/>
+              <w:bottom w:w="100" w:type="dxa"/>
+              <w:left w:w="140" w:type="dxa"/>
+              <w:right w:w="140" w:type="dxa"/>
+            </w:tcMar>
+          </w:tcPr>
+          <w:p>
+            <w:pPr>
+              <w:spacing w:before="0" w:after="0" w:line="276" w:lineRule="auto"/>
+              <w:jc w:val="left"/>
+            </w:pPr>
+            <w:r>
+              <w:rPr>
+                <w:rFonts w:ascii="Calibri" w:hAnsi="Calibri"/>
+                <w:color w:val="1A202C"/>
+                <w:sz w:val="19"/>
+              </w:rPr>
+              <w:t>Quick 60-second invoice drafting, instant UPI payment QR embedding, and mobile WhatsApp PDF sharing.</w:t>
+            </w:r>
+          </w:p>
+        </w:tc>
+      </w:tr>
+      <w:tr>
+        <w:tc>
+          <w:tcPr>
+            <w:tcW w:type="dxa" w:w="2592"/>
+            <w:shd w:val="clear" w:color="auto" w:fill="F7FAFC"/>
+            <w:tcMar>
+              <w:top w:w="100" w:type="dxa"/>
+              <w:bottom w:w="100" w:type="dxa"/>
+              <w:left w:w="140" w:type="dxa"/>
+              <w:right w:w="140" w:type="dxa"/>
+            </w:tcMar>
+          </w:tcPr>
+          <w:p>
+            <w:pPr>
+              <w:spacing w:before="0" w:after="0" w:line="276" w:lineRule="auto"/>
+              <w:jc w:val="left"/>
+            </w:pPr>
+            <w:r>
+              <w:rPr>
+                <w:rFonts w:ascii="Calibri" w:hAnsi="Calibri"/>
+                <w:color w:val="1A202C"/>
+                <w:sz w:val="19"/>
+              </w:rPr>
+              <w:t>Small Business Owner / SME</w:t>
+            </w:r>
+          </w:p>
+        </w:tc>
+        <w:tc>
+          <w:tcPr>
+            <w:tcW w:type="dxa" w:w="2016"/>
+            <w:shd w:val="clear" w:color="auto" w:fill="F7FAFC"/>
+            <w:tcMar>
+              <w:top w:w="100" w:type="dxa"/>
+              <w:bottom w:w="100" w:type="dxa"/>
+              <w:left w:w="140" w:type="dxa"/>
+              <w:right w:w="140" w:type="dxa"/>
+            </w:tcMar>
+          </w:tcPr>
+          <w:p>
+            <w:pPr>
+              <w:spacing w:before="0" w:after="0" w:line="276" w:lineRule="auto"/>
+              <w:jc w:val="left"/>
+            </w:pPr>
+            <w:r>
+              <w:rPr>
+                <w:rFonts w:ascii="Calibri" w:hAnsi="Calibri"/>
+                <w:color w:val="1A202C"/>
+                <w:sz w:val="19"/>
+              </w:rPr>
+              <w:t>Enterprise Admin</w:t>
+            </w:r>
+          </w:p>
+        </w:tc>
+        <w:tc>
+          <w:tcPr>
+            <w:tcW w:type="dxa" w:w="4752"/>
+            <w:shd w:val="clear" w:color="auto" w:fill="F7FAFC"/>
+            <w:tcMar>
+              <w:top w:w="100" w:type="dxa"/>
+              <w:bottom w:w="100" w:type="dxa"/>
+              <w:left w:w="140" w:type="dxa"/>
+              <w:right w:w="140" w:type="dxa"/>
+            </w:tcMar>
+          </w:tcPr>
+          <w:p>
+            <w:pPr>
+              <w:spacing w:before="0" w:after="0" w:line="276" w:lineRule="auto"/>
+              <w:jc w:val="left"/>
+            </w:pPr>
+            <w:r>
+              <w:rPr>
+                <w:rFonts w:ascii="Calibri" w:hAnsi="Calibri"/>
+                <w:color w:val="1A202C"/>
+                <w:sz w:val="19"/>
+              </w:rPr>
+              <w:t>Multiple client management, GSTIN and HSN rate catalogs, partial installment tracking, and CSV exports.</w:t>
+            </w:r>
+          </w:p>
+        </w:tc>
+      </w:tr>
+      <w:tr>
+        <w:tc>
+          <w:tcPr>
+            <w:tcW w:type="dxa" w:w="2592"/>
+            <w:shd w:val="clear" w:color="auto" w:fill="FFFFFF"/>
+            <w:tcMar>
+              <w:top w:w="100" w:type="dxa"/>
+              <w:bottom w:w="100" w:type="dxa"/>
+              <w:left w:w="140" w:type="dxa"/>
+              <w:right w:w="140" w:type="dxa"/>
+            </w:tcMar>
+          </w:tcPr>
+          <w:p>
+            <w:pPr>
+              <w:spacing w:before="0" w:after="0" w:line="276" w:lineRule="auto"/>
+              <w:jc w:val="left"/>
+            </w:pPr>
+            <w:r>
+              <w:rPr>
+                <w:rFonts w:ascii="Calibri" w:hAnsi="Calibri"/>
+                <w:color w:val="1A202C"/>
+                <w:sz w:val="19"/>
+              </w:rPr>
+              <w:t>Corporate Accountant / Auditor</w:t>
+            </w:r>
+          </w:p>
+        </w:tc>
+        <w:tc>
+          <w:tcPr>
+            <w:tcW w:type="dxa" w:w="2016"/>
+            <w:shd w:val="clear" w:color="auto" w:fill="FFFFFF"/>
+            <w:tcMar>
+              <w:top w:w="100" w:type="dxa"/>
+              <w:bottom w:w="100" w:type="dxa"/>
+              <w:left w:w="140" w:type="dxa"/>
+              <w:right w:w="140" w:type="dxa"/>
+            </w:tcMar>
+          </w:tcPr>
+          <w:p>
+            <w:pPr>
+              <w:spacing w:before="0" w:after="0" w:line="276" w:lineRule="auto"/>
+              <w:jc w:val="left"/>
+            </w:pPr>
+            <w:r>
+              <w:rPr>
+                <w:rFonts w:ascii="Calibri" w:hAnsi="Calibri"/>
+                <w:color w:val="1A202C"/>
+                <w:sz w:val="19"/>
+              </w:rPr>
+              <w:t>Financial Auditor</w:t>
+            </w:r>
+          </w:p>
+        </w:tc>
+        <w:tc>
+          <w:tcPr>
+            <w:tcW w:type="dxa" w:w="4752"/>
+            <w:shd w:val="clear" w:color="auto" w:fill="FFFFFF"/>
+            <w:tcMar>
+              <w:top w:w="100" w:type="dxa"/>
+              <w:bottom w:w="100" w:type="dxa"/>
+              <w:left w:w="140" w:type="dxa"/>
+              <w:right w:w="140" w:type="dxa"/>
+            </w:tcMar>
+          </w:tcPr>
+          <w:p>
+            <w:pPr>
+              <w:spacing w:before="0" w:after="0" w:line="276" w:lineRule="auto"/>
+              <w:jc w:val="left"/>
+            </w:pPr>
+            <w:r>
+              <w:rPr>
+                <w:rFonts w:ascii="Calibri" w:hAnsi="Calibri"/>
+                <w:color w:val="1A202C"/>
+                <w:sz w:val="19"/>
+              </w:rPr>
+              <w:t>HSN tax summary breakdown tables, reverse charge (RCM) indicators, and clear transaction reference audit trails.</w:t>
+            </w:r>
+          </w:p>
+        </w:tc>
+      </w:tr>
+      <w:tr>
+        <w:tc>
+          <w:tcPr>
+            <w:tcW w:type="dxa" w:w="2592"/>
+            <w:shd w:val="clear" w:color="auto" w:fill="F7FAFC"/>
+            <w:tcMar>
+              <w:top w:w="100" w:type="dxa"/>
+              <w:bottom w:w="100" w:type="dxa"/>
+              <w:left w:w="140" w:type="dxa"/>
+              <w:right w:w="140" w:type="dxa"/>
+            </w:tcMar>
+          </w:tcPr>
+          <w:p>
+            <w:pPr>
+              <w:spacing w:before="0" w:after="0" w:line="276" w:lineRule="auto"/>
+              <w:jc w:val="left"/>
+            </w:pPr>
+            <w:r>
+              <w:rPr>
+                <w:rFonts w:ascii="Calibri" w:hAnsi="Calibri"/>
+                <w:color w:val="1A202C"/>
+                <w:sz w:val="19"/>
+              </w:rPr>
+              <w:t>Client Accounts Payable</w:t>
+            </w:r>
+          </w:p>
+        </w:tc>
+        <w:tc>
+          <w:tcPr>
+            <w:tcW w:type="dxa" w:w="2016"/>
+            <w:shd w:val="clear" w:color="auto" w:fill="F7FAFC"/>
+            <w:tcMar>
+              <w:top w:w="100" w:type="dxa"/>
+              <w:bottom w:w="100" w:type="dxa"/>
+              <w:left w:w="140" w:type="dxa"/>
+              <w:right w:w="140" w:type="dxa"/>
+            </w:tcMar>
+          </w:tcPr>
+          <w:p>
+            <w:pPr>
+              <w:spacing w:before="0" w:after="0" w:line="276" w:lineRule="auto"/>
+              <w:jc w:val="left"/>
+            </w:pPr>
+            <w:r>
+              <w:rPr>
+                <w:rFonts w:ascii="Calibri" w:hAnsi="Calibri"/>
+                <w:color w:val="1A202C"/>
+                <w:sz w:val="19"/>
+              </w:rPr>
+              <w:t>End-Payer</w:t>
+            </w:r>
+          </w:p>
+        </w:tc>
+        <w:tc>
+          <w:tcPr>
+            <w:tcW w:type="dxa" w:w="4752"/>
+            <w:shd w:val="clear" w:color="auto" w:fill="F7FAFC"/>
+            <w:tcMar>
+              <w:top w:w="100" w:type="dxa"/>
+              <w:bottom w:w="100" w:type="dxa"/>
+              <w:left w:w="140" w:type="dxa"/>
+              <w:right w:w="140" w:type="dxa"/>
+            </w:tcMar>
+          </w:tcPr>
+          <w:p>
+            <w:pPr>
+              <w:spacing w:before="0" w:after="0" w:line="276" w:lineRule="auto"/>
+              <w:jc w:val="left"/>
+            </w:pPr>
+            <w:r>
+              <w:rPr>
+                <w:rFonts w:ascii="Calibri" w:hAnsi="Calibri"/>
+                <w:color w:val="1A202C"/>
+                <w:sz w:val="19"/>
+              </w:rPr>
+              <w:t>Clean, professional tax invoices with transparent payment terms and one-click UPI scanning.</w:t>
+            </w:r>
+          </w:p>
+        </w:tc>
+      </w:tr>
+    </w:tbl>
+    <w:p/>
+    <w:p>
+      <w:pPr>
+        <w:pStyle w:val="Heading2"/>
+        <w:spacing w:before="200" w:after="60"/>
+      </w:pPr>
+      <w:r>
+        <w:rPr>
+          <w:rFonts w:ascii="Calibri" w:hAnsi="Calibri"/>
+          <w:b/>
+          <w:color w:val="2C3E50"/>
+          <w:sz w:val="25"/>
+        </w:rPr>
+        <w:t>Experimental Validation &amp; Test Cases</w:t>
+      </w:r>
+    </w:p>
+    <w:tbl>
+      <w:tblPr>
+        <w:tblW w:type="auto" w:w="0"/>
+        <w:jc w:val="center"/>
+        <w:tblLayout w:type="fixed"/>
+        <w:tblLook w:firstColumn="1" w:firstRow="1" w:lastColumn="0" w:lastRow="0" w:noHBand="0" w:noVBand="1" w:val="04A0"/>
+        <w:tblBorders>
+          <w:top w:val="single" w:sz="4" w:space="0" w:color="D1D5DB"/>
+          <w:left w:val="single" w:sz="4" w:space="0" w:color="D1D5DB"/>
+          <w:bottom w:val="single" w:sz="4" w:space="0" w:color="D1D5DB"/>
+          <w:right w:val="single" w:sz="4" w:space="0" w:color="D1D5DB"/>
+          <w:insideH w:val="single" w:sz="4" w:space="0" w:color="D1D5DB"/>
+          <w:insideV w:val="single" w:sz="4" w:space="0" w:color="D1D5DB"/>
+        </w:tblBorders>
+      </w:tblPr>
+      <w:tblGrid>
+        <w:gridCol w:w="1872"/>
+        <w:gridCol w:w="1872"/>
+        <w:gridCol w:w="1872"/>
+        <w:gridCol w:w="1872"/>
+        <w:gridCol w:w="1872"/>
+      </w:tblGrid>
+      <w:tr>
+        <w:tc>
+          <w:tcPr>
+            <w:tcW w:type="dxa" w:w="1440"/>
+            <w:shd w:val="clear" w:color="auto" w:fill="1B4D4B"/>
+            <w:tcMar>
+              <w:top w:w="120" w:type="dxa"/>
+              <w:bottom w:w="120" w:type="dxa"/>
+              <w:left w:w="140" w:type="dxa"/>
+              <w:right w:w="140" w:type="dxa"/>
+            </w:tcMar>
+          </w:tcPr>
+          <w:p>
+            <w:pPr>
+              <w:spacing w:before="0" w:after="0"/>
+              <w:jc w:val="left"/>
+            </w:pPr>
+            <w:r>
+              <w:rPr>
+                <w:rFonts w:ascii="Calibri" w:hAnsi="Calibri"/>
+                <w:b/>
+                <w:color w:val="FFFFFF"/>
+                <w:sz w:val="20"/>
+              </w:rPr>
+              <w:t>Test ID</w:t>
+            </w:r>
+          </w:p>
+        </w:tc>
+        <w:tc>
+          <w:tcPr>
+            <w:tcW w:type="dxa" w:w="2592"/>
+            <w:shd w:val="clear" w:color="auto" w:fill="1B4D4B"/>
+            <w:tcMar>
+              <w:top w:w="120" w:type="dxa"/>
+              <w:bottom w:w="120" w:type="dxa"/>
+              <w:left w:w="140" w:type="dxa"/>
+              <w:right w:w="140" w:type="dxa"/>
+            </w:tcMar>
+          </w:tcPr>
+          <w:p>
+            <w:pPr>
+              <w:spacing w:before="0" w:after="0"/>
+              <w:jc w:val="left"/>
+            </w:pPr>
+            <w:r>
+              <w:rPr>
+                <w:rFonts w:ascii="Calibri" w:hAnsi="Calibri"/>
+                <w:b/>
+                <w:color w:val="FFFFFF"/>
+                <w:sz w:val="20"/>
+              </w:rPr>
+              <w:t>Scenario / Feature Tested</w:t>
+            </w:r>
+          </w:p>
+        </w:tc>
+        <w:tc>
+          <w:tcPr>
+            <w:tcW w:type="dxa" w:w="2160"/>
+            <w:shd w:val="clear" w:color="auto" w:fill="1B4D4B"/>
+            <w:tcMar>
+              <w:top w:w="120" w:type="dxa"/>
+              <w:bottom w:w="120" w:type="dxa"/>
+              <w:left w:w="140" w:type="dxa"/>
+              <w:right w:w="140" w:type="dxa"/>
+            </w:tcMar>
+          </w:tcPr>
+          <w:p>
+            <w:pPr>
+              <w:spacing w:before="0" w:after="0"/>
+              <w:jc w:val="left"/>
+            </w:pPr>
+            <w:r>
+              <w:rPr>
+                <w:rFonts w:ascii="Calibri" w:hAnsi="Calibri"/>
+                <w:b/>
+                <w:color w:val="FFFFFF"/>
+                <w:sz w:val="20"/>
+              </w:rPr>
+              <w:t>Input Data</w:t>
+            </w:r>
+          </w:p>
+        </w:tc>
+        <w:tc>
+          <w:tcPr>
+            <w:tcW w:type="dxa" w:w="2160"/>
+            <w:shd w:val="clear" w:color="auto" w:fill="1B4D4B"/>
+            <w:tcMar>
+              <w:top w:w="120" w:type="dxa"/>
+              <w:bottom w:w="120" w:type="dxa"/>
+              <w:left w:w="140" w:type="dxa"/>
+              <w:right w:w="140" w:type="dxa"/>
+            </w:tcMar>
+          </w:tcPr>
+          <w:p>
+            <w:pPr>
+              <w:spacing w:before="0" w:after="0"/>
+              <w:jc w:val="left"/>
+            </w:pPr>
+            <w:r>
+              <w:rPr>
+                <w:rFonts w:ascii="Calibri" w:hAnsi="Calibri"/>
+                <w:b/>
+                <w:color w:val="FFFFFF"/>
+                <w:sz w:val="20"/>
+              </w:rPr>
+              <w:t>Expected Result</w:t>
+            </w:r>
+          </w:p>
+        </w:tc>
+        <w:tc>
+          <w:tcPr>
+            <w:tcW w:type="dxa" w:w="1008"/>
+            <w:shd w:val="clear" w:color="auto" w:fill="1B4D4B"/>
+            <w:tcMar>
+              <w:top w:w="120" w:type="dxa"/>
+              <w:bottom w:w="120" w:type="dxa"/>
+              <w:left w:w="140" w:type="dxa"/>
+              <w:right w:w="140" w:type="dxa"/>
+            </w:tcMar>
+          </w:tcPr>
+          <w:p>
+            <w:pPr>
+              <w:spacing w:before="0" w:after="0"/>
+              <w:jc w:val="left"/>
+            </w:pPr>
+            <w:r>
+              <w:rPr>
+                <w:rFonts w:ascii="Calibri" w:hAnsi="Calibri"/>
+                <w:b/>
+                <w:color w:val="FFFFFF"/>
+                <w:sz w:val="20"/>
+              </w:rPr>
+              <w:t>Status</w:t>
+            </w:r>
+          </w:p>
+        </w:tc>
+      </w:tr>
+      <w:tr>
+        <w:tc>
+          <w:tcPr>
+            <w:tcW w:type="dxa" w:w="1440"/>
+            <w:shd w:val="clear" w:color="auto" w:fill="FFFFFF"/>
+            <w:tcMar>
+              <w:top w:w="100" w:type="dxa"/>
+              <w:bottom w:w="100" w:type="dxa"/>
+              <w:left w:w="140" w:type="dxa"/>
+              <w:right w:w="140" w:type="dxa"/>
+            </w:tcMar>
+          </w:tcPr>
+          <w:p>
+            <w:pPr>
+              <w:spacing w:before="0" w:after="0" w:line="276" w:lineRule="auto"/>
+              <w:jc w:val="left"/>
+            </w:pPr>
+            <w:r>
+              <w:rPr>
+                <w:rFonts w:ascii="Calibri" w:hAnsi="Calibri"/>
+                <w:color w:val="1A202C"/>
+                <w:sz w:val="19"/>
+              </w:rPr>
+              <w:t>TC_CONC_01</w:t>
+            </w:r>
+          </w:p>
+        </w:tc>
+        <w:tc>
+          <w:tcPr>
+            <w:tcW w:type="dxa" w:w="2592"/>
+            <w:shd w:val="clear" w:color="auto" w:fill="FFFFFF"/>
+            <w:tcMar>
+              <w:top w:w="100" w:type="dxa"/>
+              <w:bottom w:w="100" w:type="dxa"/>
+              <w:left w:w="140" w:type="dxa"/>
+              <w:right w:w="140" w:type="dxa"/>
+            </w:tcMar>
+          </w:tcPr>
+          <w:p>
+            <w:pPr>
+              <w:spacing w:before="0" w:after="0" w:line="276" w:lineRule="auto"/>
+              <w:jc w:val="left"/>
+            </w:pPr>
+            <w:r>
+              <w:rPr>
+                <w:rFonts w:ascii="Calibri" w:hAnsi="Calibri"/>
+                <w:color w:val="1A202C"/>
+                <w:sz w:val="19"/>
+              </w:rPr>
+              <w:t>Verify offline initialization</w:t>
+            </w:r>
+          </w:p>
+        </w:tc>
+        <w:tc>
+          <w:tcPr>
+            <w:tcW w:type="dxa" w:w="2160"/>
+            <w:shd w:val="clear" w:color="auto" w:fill="FFFFFF"/>
+            <w:tcMar>
+              <w:top w:w="100" w:type="dxa"/>
+              <w:bottom w:w="100" w:type="dxa"/>
+              <w:left w:w="140" w:type="dxa"/>
+              <w:right w:w="140" w:type="dxa"/>
+            </w:tcMar>
+          </w:tcPr>
+          <w:p>
+            <w:pPr>
+              <w:spacing w:before="0" w:after="0" w:line="276" w:lineRule="auto"/>
+              <w:jc w:val="left"/>
+            </w:pPr>
+            <w:r>
+              <w:rPr>
+                <w:rFonts w:ascii="Calibri" w:hAnsi="Calibri"/>
+                <w:color w:val="1A202C"/>
+                <w:sz w:val="19"/>
+              </w:rPr>
+              <w:t>Launch app without active WiFi/Internet</w:t>
+            </w:r>
+          </w:p>
+        </w:tc>
+        <w:tc>
+          <w:tcPr>
+            <w:tcW w:type="dxa" w:w="2160"/>
+            <w:shd w:val="clear" w:color="auto" w:fill="FFFFFF"/>
+            <w:tcMar>
+              <w:top w:w="100" w:type="dxa"/>
+              <w:bottom w:w="100" w:type="dxa"/>
+              <w:left w:w="140" w:type="dxa"/>
+              <w:right w:w="140" w:type="dxa"/>
+            </w:tcMar>
+          </w:tcPr>
+          <w:p>
+            <w:pPr>
+              <w:spacing w:before="0" w:after="0" w:line="276" w:lineRule="auto"/>
+              <w:jc w:val="left"/>
+            </w:pPr>
+            <w:r>
+              <w:rPr>
+                <w:rFonts w:ascii="Calibri" w:hAnsi="Calibri"/>
+                <w:color w:val="1A202C"/>
+                <w:sz w:val="19"/>
+              </w:rPr>
+              <w:t>Service worker serves cached app shell seamlessly</w:t>
+            </w:r>
+          </w:p>
+        </w:tc>
+        <w:tc>
+          <w:tcPr>
+            <w:tcW w:type="dxa" w:w="1008"/>
+            <w:shd w:val="clear" w:color="auto" w:fill="FFFFFF"/>
+            <w:tcMar>
+              <w:top w:w="100" w:type="dxa"/>
+              <w:bottom w:w="100" w:type="dxa"/>
+              <w:left w:w="140" w:type="dxa"/>
+              <w:right w:w="140" w:type="dxa"/>
+            </w:tcMar>
+          </w:tcPr>
+          <w:p>
+            <w:pPr>
+              <w:spacing w:before="0" w:after="0" w:line="276" w:lineRule="auto"/>
+              <w:jc w:val="left"/>
+            </w:pPr>
+            <w:r>
+              <w:rPr>
+                <w:rFonts w:ascii="Calibri" w:hAnsi="Calibri"/>
+                <w:color w:val="1A202C"/>
+                <w:sz w:val="19"/>
+              </w:rPr>
+              <w:t>Pass</w:t>
+            </w:r>
+          </w:p>
+        </w:tc>
+      </w:tr>
+      <w:tr>
+        <w:tc>
+          <w:tcPr>
+            <w:tcW w:type="dxa" w:w="1440"/>
+            <w:shd w:val="clear" w:color="auto" w:fill="F7FAFC"/>
+            <w:tcMar>
+              <w:top w:w="100" w:type="dxa"/>
+              <w:bottom w:w="100" w:type="dxa"/>
+              <w:left w:w="140" w:type="dxa"/>
+              <w:right w:w="140" w:type="dxa"/>
+            </w:tcMar>
+          </w:tcPr>
+          <w:p>
+            <w:pPr>
+              <w:spacing w:before="0" w:after="0" w:line="276" w:lineRule="auto"/>
+              <w:jc w:val="left"/>
+            </w:pPr>
+            <w:r>
+              <w:rPr>
+                <w:rFonts w:ascii="Calibri" w:hAnsi="Calibri"/>
+                <w:color w:val="1A202C"/>
+                <w:sz w:val="19"/>
+              </w:rPr>
+              <w:t>TC_CONC_02</w:t>
+            </w:r>
+          </w:p>
+        </w:tc>
+        <w:tc>
+          <w:tcPr>
+            <w:tcW w:type="dxa" w:w="2592"/>
+            <w:shd w:val="clear" w:color="auto" w:fill="F7FAFC"/>
+            <w:tcMar>
+              <w:top w:w="100" w:type="dxa"/>
+              <w:bottom w:w="100" w:type="dxa"/>
+              <w:left w:w="140" w:type="dxa"/>
+              <w:right w:w="140" w:type="dxa"/>
+            </w:tcMar>
+          </w:tcPr>
+          <w:p>
+            <w:pPr>
+              <w:spacing w:before="0" w:after="0" w:line="276" w:lineRule="auto"/>
+              <w:jc w:val="left"/>
+            </w:pPr>
+            <w:r>
+              <w:rPr>
+                <w:rFonts w:ascii="Calibri" w:hAnsi="Calibri"/>
+                <w:color w:val="1A202C"/>
+                <w:sz w:val="19"/>
+              </w:rPr>
+              <w:t>Verify local persistence</w:t>
+            </w:r>
+          </w:p>
+        </w:tc>
+        <w:tc>
+          <w:tcPr>
+            <w:tcW w:type="dxa" w:w="2160"/>
+            <w:shd w:val="clear" w:color="auto" w:fill="F7FAFC"/>
+            <w:tcMar>
+              <w:top w:w="100" w:type="dxa"/>
+              <w:bottom w:w="100" w:type="dxa"/>
+              <w:left w:w="140" w:type="dxa"/>
+              <w:right w:w="140" w:type="dxa"/>
+            </w:tcMar>
+          </w:tcPr>
+          <w:p>
+            <w:pPr>
+              <w:spacing w:before="0" w:after="0" w:line="276" w:lineRule="auto"/>
+              <w:jc w:val="left"/>
+            </w:pPr>
+            <w:r>
+              <w:rPr>
+                <w:rFonts w:ascii="Calibri" w:hAnsi="Calibri"/>
+                <w:color w:val="1A202C"/>
+                <w:sz w:val="19"/>
+              </w:rPr>
+              <w:t>Refresh browser after entering client details</w:t>
+            </w:r>
+          </w:p>
+        </w:tc>
+        <w:tc>
+          <w:tcPr>
+            <w:tcW w:type="dxa" w:w="2160"/>
+            <w:shd w:val="clear" w:color="auto" w:fill="F7FAFC"/>
+            <w:tcMar>
+              <w:top w:w="100" w:type="dxa"/>
+              <w:bottom w:w="100" w:type="dxa"/>
+              <w:left w:w="140" w:type="dxa"/>
+              <w:right w:w="140" w:type="dxa"/>
+            </w:tcMar>
+          </w:tcPr>
+          <w:p>
+            <w:pPr>
+              <w:spacing w:before="0" w:after="0" w:line="276" w:lineRule="auto"/>
+              <w:jc w:val="left"/>
+            </w:pPr>
+            <w:r>
+              <w:rPr>
+                <w:rFonts w:ascii="Calibri" w:hAnsi="Calibri"/>
+                <w:color w:val="1A202C"/>
+                <w:sz w:val="19"/>
+              </w:rPr>
+              <w:t>Client data persists intact in localStorage buffer</w:t>
+            </w:r>
+          </w:p>
+        </w:tc>
+        <w:tc>
+          <w:tcPr>
+            <w:tcW w:type="dxa" w:w="1008"/>
+            <w:shd w:val="clear" w:color="auto" w:fill="F7FAFC"/>
+            <w:tcMar>
+              <w:top w:w="100" w:type="dxa"/>
+              <w:bottom w:w="100" w:type="dxa"/>
+              <w:left w:w="140" w:type="dxa"/>
+              <w:right w:w="140" w:type="dxa"/>
+            </w:tcMar>
+          </w:tcPr>
+          <w:p>
+            <w:pPr>
+              <w:spacing w:before="0" w:after="0" w:line="276" w:lineRule="auto"/>
+              <w:jc w:val="left"/>
+            </w:pPr>
+            <w:r>
+              <w:rPr>
+                <w:rFonts w:ascii="Calibri" w:hAnsi="Calibri"/>
+                <w:color w:val="1A202C"/>
+                <w:sz w:val="19"/>
+              </w:rPr>
+              <w:t>Pass</w:t>
+            </w:r>
+          </w:p>
+        </w:tc>
+      </w:tr>
+      <w:tr>
+        <w:tc>
+          <w:tcPr>
+            <w:tcW w:type="dxa" w:w="1440"/>
+            <w:shd w:val="clear" w:color="auto" w:fill="FFFFFF"/>
+            <w:tcMar>
+              <w:top w:w="100" w:type="dxa"/>
+              <w:bottom w:w="100" w:type="dxa"/>
+              <w:left w:w="140" w:type="dxa"/>
+              <w:right w:w="140" w:type="dxa"/>
+            </w:tcMar>
+          </w:tcPr>
+          <w:p>
+            <w:pPr>
+              <w:spacing w:before="0" w:after="0" w:line="276" w:lineRule="auto"/>
+              <w:jc w:val="left"/>
+            </w:pPr>
+            <w:r>
+              <w:rPr>
+                <w:rFonts w:ascii="Calibri" w:hAnsi="Calibri"/>
+                <w:color w:val="1A202C"/>
+                <w:sz w:val="19"/>
+              </w:rPr>
+              <w:t>TC_CONC_03</w:t>
+            </w:r>
+          </w:p>
+        </w:tc>
+        <w:tc>
+          <w:tcPr>
+            <w:tcW w:type="dxa" w:w="2592"/>
+            <w:shd w:val="clear" w:color="auto" w:fill="FFFFFF"/>
+            <w:tcMar>
+              <w:top w:w="100" w:type="dxa"/>
+              <w:bottom w:w="100" w:type="dxa"/>
+              <w:left w:w="140" w:type="dxa"/>
+              <w:right w:w="140" w:type="dxa"/>
+            </w:tcMar>
+          </w:tcPr>
+          <w:p>
+            <w:pPr>
+              <w:spacing w:before="0" w:after="0" w:line="276" w:lineRule="auto"/>
+              <w:jc w:val="left"/>
+            </w:pPr>
+            <w:r>
+              <w:rPr>
+                <w:rFonts w:ascii="Calibri" w:hAnsi="Calibri"/>
+                <w:color w:val="1A202C"/>
+                <w:sz w:val="19"/>
+              </w:rPr>
+              <w:t>Verify currency precision</w:t>
+            </w:r>
+          </w:p>
+        </w:tc>
+        <w:tc>
+          <w:tcPr>
+            <w:tcW w:type="dxa" w:w="2160"/>
+            <w:shd w:val="clear" w:color="auto" w:fill="FFFFFF"/>
+            <w:tcMar>
+              <w:top w:w="100" w:type="dxa"/>
+              <w:bottom w:w="100" w:type="dxa"/>
+              <w:left w:w="140" w:type="dxa"/>
+              <w:right w:w="140" w:type="dxa"/>
+            </w:tcMar>
+          </w:tcPr>
+          <w:p>
+            <w:pPr>
+              <w:spacing w:before="0" w:after="0" w:line="276" w:lineRule="auto"/>
+              <w:jc w:val="left"/>
+            </w:pPr>
+            <w:r>
+              <w:rPr>
+                <w:rFonts w:ascii="Calibri" w:hAnsi="Calibri"/>
+                <w:color w:val="1A202C"/>
+                <w:sz w:val="19"/>
+              </w:rPr>
+              <w:t>Item with 3 decimal precision</w:t>
+            </w:r>
+          </w:p>
+        </w:tc>
+        <w:tc>
+          <w:tcPr>
+            <w:tcW w:type="dxa" w:w="2160"/>
+            <w:shd w:val="clear" w:color="auto" w:fill="FFFFFF"/>
+            <w:tcMar>
+              <w:top w:w="100" w:type="dxa"/>
+              <w:bottom w:w="100" w:type="dxa"/>
+              <w:left w:w="140" w:type="dxa"/>
+              <w:right w:w="140" w:type="dxa"/>
+            </w:tcMar>
+          </w:tcPr>
+          <w:p>
+            <w:pPr>
+              <w:spacing w:before="0" w:after="0" w:line="276" w:lineRule="auto"/>
+              <w:jc w:val="left"/>
+            </w:pPr>
+            <w:r>
+              <w:rPr>
+                <w:rFonts w:ascii="Calibri" w:hAnsi="Calibri"/>
+                <w:color w:val="1A202C"/>
+                <w:sz w:val="19"/>
+              </w:rPr>
+              <w:t>System formats value to exact 2 decimal currency notation</w:t>
+            </w:r>
+          </w:p>
+        </w:tc>
+        <w:tc>
+          <w:tcPr>
+            <w:tcW w:type="dxa" w:w="1008"/>
+            <w:shd w:val="clear" w:color="auto" w:fill="FFFFFF"/>
+            <w:tcMar>
+              <w:top w:w="100" w:type="dxa"/>
+              <w:bottom w:w="100" w:type="dxa"/>
+              <w:left w:w="140" w:type="dxa"/>
+              <w:right w:w="140" w:type="dxa"/>
+            </w:tcMar>
+          </w:tcPr>
+          <w:p>
+            <w:pPr>
+              <w:spacing w:before="0" w:after="0" w:line="276" w:lineRule="auto"/>
+              <w:jc w:val="left"/>
+            </w:pPr>
+            <w:r>
+              <w:rPr>
+                <w:rFonts w:ascii="Calibri" w:hAnsi="Calibri"/>
+                <w:color w:val="1A202C"/>
+                <w:sz w:val="19"/>
+              </w:rPr>
+              <w:t>Pass</w:t>
+            </w:r>
+          </w:p>
+        </w:tc>
+      </w:tr>
+      <w:tr>
+        <w:tc>
+          <w:tcPr>
+            <w:tcW w:type="dxa" w:w="1440"/>
+            <w:shd w:val="clear" w:color="auto" w:fill="F7FAFC"/>
+            <w:tcMar>
+              <w:top w:w="100" w:type="dxa"/>
+              <w:bottom w:w="100" w:type="dxa"/>
+              <w:left w:w="140" w:type="dxa"/>
+              <w:right w:w="140" w:type="dxa"/>
+            </w:tcMar>
+          </w:tcPr>
+          <w:p>
+            <w:pPr>
+              <w:spacing w:before="0" w:after="0" w:line="276" w:lineRule="auto"/>
+              <w:jc w:val="left"/>
+            </w:pPr>
+            <w:r>
+              <w:rPr>
+                <w:rFonts w:ascii="Calibri" w:hAnsi="Calibri"/>
+                <w:color w:val="1A202C"/>
+                <w:sz w:val="19"/>
+              </w:rPr>
+              <w:t>TC_CONC_04</w:t>
+            </w:r>
+          </w:p>
+        </w:tc>
+        <w:tc>
+          <w:tcPr>
+            <w:tcW w:type="dxa" w:w="2592"/>
+            <w:shd w:val="clear" w:color="auto" w:fill="F7FAFC"/>
+            <w:tcMar>
+              <w:top w:w="100" w:type="dxa"/>
+              <w:bottom w:w="100" w:type="dxa"/>
+              <w:left w:w="140" w:type="dxa"/>
+              <w:right w:w="140" w:type="dxa"/>
+            </w:tcMar>
+          </w:tcPr>
+          <w:p>
+            <w:pPr>
+              <w:spacing w:before="0" w:after="0" w:line="276" w:lineRule="auto"/>
+              <w:jc w:val="left"/>
+            </w:pPr>
+            <w:r>
+              <w:rPr>
+                <w:rFonts w:ascii="Calibri" w:hAnsi="Calibri"/>
+                <w:color w:val="1A202C"/>
+                <w:sz w:val="19"/>
+              </w:rPr>
+              <w:t>Verify GST intra-state split</w:t>
+            </w:r>
+          </w:p>
+        </w:tc>
+        <w:tc>
+          <w:tcPr>
+            <w:tcW w:type="dxa" w:w="2160"/>
+            <w:shd w:val="clear" w:color="auto" w:fill="F7FAFC"/>
+            <w:tcMar>
+              <w:top w:w="100" w:type="dxa"/>
+              <w:bottom w:w="100" w:type="dxa"/>
+              <w:left w:w="140" w:type="dxa"/>
+              <w:right w:w="140" w:type="dxa"/>
+            </w:tcMar>
+          </w:tcPr>
+          <w:p>
+            <w:pPr>
+              <w:spacing w:before="0" w:after="0" w:line="276" w:lineRule="auto"/>
+              <w:jc w:val="left"/>
+            </w:pPr>
+            <w:r>
+              <w:rPr>
+                <w:rFonts w:ascii="Calibri" w:hAnsi="Calibri"/>
+                <w:color w:val="1A202C"/>
+                <w:sz w:val="19"/>
+              </w:rPr>
+              <w:t>18% tax on intra-state transaction</w:t>
+            </w:r>
+          </w:p>
+        </w:tc>
+        <w:tc>
+          <w:tcPr>
+            <w:tcW w:type="dxa" w:w="2160"/>
+            <w:shd w:val="clear" w:color="auto" w:fill="F7FAFC"/>
+            <w:tcMar>
+              <w:top w:w="100" w:type="dxa"/>
+              <w:bottom w:w="100" w:type="dxa"/>
+              <w:left w:w="140" w:type="dxa"/>
+              <w:right w:w="140" w:type="dxa"/>
+            </w:tcMar>
+          </w:tcPr>
+          <w:p>
+            <w:pPr>
+              <w:spacing w:before="0" w:after="0" w:line="276" w:lineRule="auto"/>
+              <w:jc w:val="left"/>
+            </w:pPr>
+            <w:r>
+              <w:rPr>
+                <w:rFonts w:ascii="Calibri" w:hAnsi="Calibri"/>
+                <w:color w:val="1A202C"/>
+                <w:sz w:val="19"/>
+              </w:rPr>
+              <w:t>9% CGST and 9% SGST calculated accurately</w:t>
+            </w:r>
+          </w:p>
+        </w:tc>
+        <w:tc>
+          <w:tcPr>
+            <w:tcW w:type="dxa" w:w="1008"/>
+            <w:shd w:val="clear" w:color="auto" w:fill="F7FAFC"/>
+            <w:tcMar>
+              <w:top w:w="100" w:type="dxa"/>
+              <w:bottom w:w="100" w:type="dxa"/>
+              <w:left w:w="140" w:type="dxa"/>
+              <w:right w:w="140" w:type="dxa"/>
+            </w:tcMar>
+          </w:tcPr>
+          <w:p>
+            <w:pPr>
+              <w:spacing w:before="0" w:after="0" w:line="276" w:lineRule="auto"/>
+              <w:jc w:val="left"/>
+            </w:pPr>
+            <w:r>
+              <w:rPr>
+                <w:rFonts w:ascii="Calibri" w:hAnsi="Calibri"/>
+                <w:color w:val="1A202C"/>
+                <w:sz w:val="19"/>
+              </w:rPr>
+              <w:t>Pass</w:t>
+            </w:r>
+          </w:p>
+        </w:tc>
+      </w:tr>
+      <w:tr>
+        <w:tc>
+          <w:tcPr>
+            <w:tcW w:type="dxa" w:w="1440"/>
+            <w:shd w:val="clear" w:color="auto" w:fill="FFFFFF"/>
+            <w:tcMar>
+              <w:top w:w="100" w:type="dxa"/>
+              <w:bottom w:w="100" w:type="dxa"/>
+              <w:left w:w="140" w:type="dxa"/>
+              <w:right w:w="140" w:type="dxa"/>
+            </w:tcMar>
+          </w:tcPr>
+          <w:p>
+            <w:pPr>
+              <w:spacing w:before="0" w:after="0" w:line="276" w:lineRule="auto"/>
+              <w:jc w:val="left"/>
+            </w:pPr>
+            <w:r>
+              <w:rPr>
+                <w:rFonts w:ascii="Calibri" w:hAnsi="Calibri"/>
+                <w:color w:val="1A202C"/>
+                <w:sz w:val="19"/>
+              </w:rPr>
+              <w:t>TC_CONC_05</w:t>
+            </w:r>
+          </w:p>
+        </w:tc>
+        <w:tc>
+          <w:tcPr>
+            <w:tcW w:type="dxa" w:w="2592"/>
+            <w:shd w:val="clear" w:color="auto" w:fill="FFFFFF"/>
+            <w:tcMar>
+              <w:top w:w="100" w:type="dxa"/>
+              <w:bottom w:w="100" w:type="dxa"/>
+              <w:left w:w="140" w:type="dxa"/>
+              <w:right w:w="140" w:type="dxa"/>
+            </w:tcMar>
+          </w:tcPr>
+          <w:p>
+            <w:pPr>
+              <w:spacing w:before="0" w:after="0" w:line="276" w:lineRule="auto"/>
+              <w:jc w:val="left"/>
+            </w:pPr>
+            <w:r>
+              <w:rPr>
+                <w:rFonts w:ascii="Calibri" w:hAnsi="Calibri"/>
+                <w:color w:val="1A202C"/>
+                <w:sz w:val="19"/>
+              </w:rPr>
+              <w:t>Verify mobile viewport layout</w:t>
+            </w:r>
+          </w:p>
+        </w:tc>
+        <w:tc>
+          <w:tcPr>
+            <w:tcW w:type="dxa" w:w="2160"/>
+            <w:shd w:val="clear" w:color="auto" w:fill="FFFFFF"/>
+            <w:tcMar>
+              <w:top w:w="100" w:type="dxa"/>
+              <w:bottom w:w="100" w:type="dxa"/>
+              <w:left w:w="140" w:type="dxa"/>
+              <w:right w:w="140" w:type="dxa"/>
+            </w:tcMar>
+          </w:tcPr>
+          <w:p>
+            <w:pPr>
+              <w:spacing w:before="0" w:after="0" w:line="276" w:lineRule="auto"/>
+              <w:jc w:val="left"/>
+            </w:pPr>
+            <w:r>
+              <w:rPr>
+                <w:rFonts w:ascii="Calibri" w:hAnsi="Calibri"/>
+                <w:color w:val="1A202C"/>
+                <w:sz w:val="19"/>
+              </w:rPr>
+              <w:t>Simulated 375px screen width</w:t>
+            </w:r>
+          </w:p>
+        </w:tc>
+        <w:tc>
+          <w:tcPr>
+            <w:tcW w:type="dxa" w:w="2160"/>
+            <w:shd w:val="clear" w:color="auto" w:fill="FFFFFF"/>
+            <w:tcMar>
+              <w:top w:w="100" w:type="dxa"/>
+              <w:bottom w:w="100" w:type="dxa"/>
+              <w:left w:w="140" w:type="dxa"/>
+              <w:right w:w="140" w:type="dxa"/>
+            </w:tcMar>
+          </w:tcPr>
+          <w:p>
+            <w:pPr>
+              <w:spacing w:before="0" w:after="0" w:line="276" w:lineRule="auto"/>
+              <w:jc w:val="left"/>
+            </w:pPr>
+            <w:r>
+              <w:rPr>
+                <w:rFonts w:ascii="Calibri" w:hAnsi="Calibri"/>
+                <w:color w:val="1A202C"/>
+                <w:sz w:val="19"/>
+              </w:rPr>
+              <w:t>Sidebar converts to off-canvas responsive drawer</w:t>
+            </w:r>
+          </w:p>
+        </w:tc>
+        <w:tc>
+          <w:tcPr>
+            <w:tcW w:type="dxa" w:w="1008"/>
+            <w:shd w:val="clear" w:color="auto" w:fill="FFFFFF"/>
+            <w:tcMar>
+              <w:top w:w="100" w:type="dxa"/>
+              <w:bottom w:w="100" w:type="dxa"/>
+              <w:left w:w="140" w:type="dxa"/>
+              <w:right w:w="140" w:type="dxa"/>
+            </w:tcMar>
+          </w:tcPr>
+          <w:p>
+            <w:pPr>
+              <w:spacing w:before="0" w:after="0" w:line="276" w:lineRule="auto"/>
+              <w:jc w:val="left"/>
+            </w:pPr>
+            <w:r>
+              <w:rPr>
+                <w:rFonts w:ascii="Calibri" w:hAnsi="Calibri"/>
+                <w:color w:val="1A202C"/>
+                <w:sz w:val="19"/>
+              </w:rPr>
+              <w:t>Pass</w:t>
+            </w:r>
+          </w:p>
+        </w:tc>
+      </w:tr>
+    </w:tbl>
+    <w:p/>
+    <w:p>
+      <w:pPr>
+        <w:pStyle w:val="Heading2"/>
+        <w:spacing w:before="200" w:after="60"/>
+      </w:pPr>
+      <w:r>
+        <w:rPr>
+          <w:rFonts w:ascii="Calibri" w:hAnsi="Calibri"/>
+          <w:b/>
+          <w:color w:val="2C3E50"/>
+          <w:sz w:val="25"/>
+        </w:rPr>
+        <w:t>Review &amp; Viva-Voce Questions with Solutions</w:t>
       </w:r>
     </w:p>
     <w:p>
+      <w:pPr>
+        <w:spacing w:before="0" w:after="90" w:line="276" w:lineRule="auto"/>
+      </w:pPr>
       <w:r>
-        <w:t>The project 'Ledgerly (Invoice &amp; Quotation Generator)' was successfully conceptualized with an exhaustive problem definition, well-bounded scope, distinct stakeholder profiles, structured functional modules, and thorough feasibility validation. This robust foundation establishes the operational framework for subsequent software engineering phases including requirements modeling, UI architecture, UML diagrams, automated testing, and deployment.</w:t>
+        <w:rPr>
+          <w:rFonts w:ascii="Calibri" w:hAnsi="Calibri"/>
+          <w:color w:val="1A202C"/>
+          <w:sz w:val="21"/>
+        </w:rPr>
+        <w:t>The following technical review questions assess core understanding of software engineering principles, web runtime behavior, and architecture applied in this experiment:</w:t>
+      </w:r>
+    </w:p>
+    <w:p>
+      <w:pPr>
+        <w:spacing w:before="120" w:after="40" w:line="276" w:lineRule="auto"/>
+      </w:pPr>
+      <w:r>
+        <w:rPr>
+          <w:rFonts w:ascii="Calibri" w:hAnsi="Calibri"/>
+          <w:b/>
+          <w:color w:val="1B4D4B"/>
+          <w:sz w:val="21"/>
+        </w:rPr>
+        <w:t>Q1. What is a Progressive Web Application (PWA) and how does it benefit an invoicing solution?</w:t>
+      </w:r>
+    </w:p>
+    <w:p>
+      <w:pPr>
+        <w:spacing w:before="0" w:after="120" w:line="276" w:lineRule="auto"/>
+      </w:pPr>
+      <w:r>
+        <w:rPr>
+          <w:rFonts w:ascii="Calibri" w:hAnsi="Calibri"/>
+          <w:b/>
+          <w:color w:val="2C3E50"/>
+          <w:sz w:val="20"/>
+        </w:rPr>
+        <w:t xml:space="preserve">Answer: </w:t>
+      </w:r>
+      <w:r>
+        <w:rPr>
+          <w:rFonts w:ascii="Calibri" w:hAnsi="Calibri"/>
+          <w:color w:val="1A202C"/>
+          <w:sz w:val="20"/>
+        </w:rPr>
+        <w:t>A PWA combines the ubiquitous reach of the web with the native responsiveness of installed desktop/mobile apps. By leveraging Service Workers for caching static assets and client-side storage (localStorage/IndexedDB), Ledgerly operates seamlessly without internet access, eliminating downtime for small businesses.</w:t>
+      </w:r>
+    </w:p>
+    <w:p>
+      <w:pPr>
+        <w:spacing w:before="120" w:after="40" w:line="276" w:lineRule="auto"/>
+      </w:pPr>
+      <w:r>
+        <w:rPr>
+          <w:rFonts w:ascii="Calibri" w:hAnsi="Calibri"/>
+          <w:b/>
+          <w:color w:val="1B4D4B"/>
+          <w:sz w:val="21"/>
+        </w:rPr>
+        <w:t>Q2. Why was a pure client-side architecture chosen over a multi-tenant cloud backend?</w:t>
+      </w:r>
+    </w:p>
+    <w:p>
+      <w:pPr>
+        <w:spacing w:before="0" w:after="120" w:line="276" w:lineRule="auto"/>
+      </w:pPr>
+      <w:r>
+        <w:rPr>
+          <w:rFonts w:ascii="Calibri" w:hAnsi="Calibri"/>
+          <w:b/>
+          <w:color w:val="2C3E50"/>
+          <w:sz w:val="20"/>
+        </w:rPr>
+        <w:t xml:space="preserve">Answer: </w:t>
+      </w:r>
+      <w:r>
+        <w:rPr>
+          <w:rFonts w:ascii="Calibri" w:hAnsi="Calibri"/>
+          <w:color w:val="1A202C"/>
+          <w:sz w:val="20"/>
+        </w:rPr>
+        <w:t>Client-side architecture guarantees complete data sovereignty: financial transactions and client contacts are stored exclusively on the user's hardware. Furthermore, it eliminates backend operational costs, server latency, and third-party data breach vectors.</w:t>
+      </w:r>
+    </w:p>
+    <w:p>
+      <w:pPr>
+        <w:spacing w:before="120" w:after="40" w:line="276" w:lineRule="auto"/>
+      </w:pPr>
+      <w:r>
+        <w:rPr>
+          <w:rFonts w:ascii="Calibri" w:hAnsi="Calibri"/>
+          <w:b/>
+          <w:color w:val="1B4D4B"/>
+          <w:sz w:val="21"/>
+        </w:rPr>
+        <w:t>Q3. How does the system ensure consecutive invoice numbers without a central database server?</w:t>
+      </w:r>
+    </w:p>
+    <w:p>
+      <w:pPr>
+        <w:spacing w:before="0" w:after="120" w:line="276" w:lineRule="auto"/>
+      </w:pPr>
+      <w:r>
+        <w:rPr>
+          <w:rFonts w:ascii="Calibri" w:hAnsi="Calibri"/>
+          <w:b/>
+          <w:color w:val="2C3E50"/>
+          <w:sz w:val="20"/>
+        </w:rPr>
+        <w:t xml:space="preserve">Answer: </w:t>
+      </w:r>
+      <w:r>
+        <w:rPr>
+          <w:rFonts w:ascii="Calibri" w:hAnsi="Calibri"/>
+          <w:color w:val="1A202C"/>
+          <w:sz w:val="20"/>
+        </w:rPr>
+        <w:t>The client engine scans all existing invoice documents belonging to the active user profile, identifies the highest incremental counter for the current calendar year, and auto-generates the next sequential identifier (e.g., INV-2026-004) while actively checking for collisions.</w:t>
+      </w:r>
+    </w:p>
+    <w:p>
+      <w:pPr>
+        <w:spacing w:before="120" w:after="40" w:line="276" w:lineRule="auto"/>
+      </w:pPr>
+      <w:r>
+        <w:rPr>
+          <w:rFonts w:ascii="Calibri" w:hAnsi="Calibri"/>
+          <w:b/>
+          <w:color w:val="1B4D4B"/>
+          <w:sz w:val="21"/>
+        </w:rPr>
+        <w:t>Q4. What is the significance of the HSN/SAC code in Indian Goods and Services Tax?</w:t>
+      </w:r>
+    </w:p>
+    <w:p>
+      <w:pPr>
+        <w:spacing w:before="0" w:after="120" w:line="276" w:lineRule="auto"/>
+      </w:pPr>
+      <w:r>
+        <w:rPr>
+          <w:rFonts w:ascii="Calibri" w:hAnsi="Calibri"/>
+          <w:b/>
+          <w:color w:val="2C3E50"/>
+          <w:sz w:val="20"/>
+        </w:rPr>
+        <w:t xml:space="preserve">Answer: </w:t>
+      </w:r>
+      <w:r>
+        <w:rPr>
+          <w:rFonts w:ascii="Calibri" w:hAnsi="Calibri"/>
+          <w:color w:val="1A202C"/>
+          <w:sz w:val="20"/>
+        </w:rPr>
+        <w:t>HSN (Harmonized System of Nomenclature) and SAC (Services Accounting Code) are international standard codes used by tax authorities to classify goods and services. Ledgerly aggregates items by their HSN/SAC to provide a compliant tax breakdown table required for B2B input tax credits.</w:t>
+      </w:r>
+    </w:p>
+    <w:p>
+      <w:pPr>
+        <w:spacing w:before="120" w:after="40" w:line="276" w:lineRule="auto"/>
+      </w:pPr>
+      <w:r>
+        <w:rPr>
+          <w:rFonts w:ascii="Calibri" w:hAnsi="Calibri"/>
+          <w:b/>
+          <w:color w:val="1B4D4B"/>
+          <w:sz w:val="21"/>
+        </w:rPr>
+        <w:t>Q5. How are digital signatures captured and stored in a client-rendered environment?</w:t>
+      </w:r>
+    </w:p>
+    <w:p>
+      <w:pPr>
+        <w:spacing w:before="0" w:after="120" w:line="276" w:lineRule="auto"/>
+      </w:pPr>
+      <w:r>
+        <w:rPr>
+          <w:rFonts w:ascii="Calibri" w:hAnsi="Calibri"/>
+          <w:b/>
+          <w:color w:val="2C3E50"/>
+          <w:sz w:val="20"/>
+        </w:rPr>
+        <w:t xml:space="preserve">Answer: </w:t>
+      </w:r>
+      <w:r>
+        <w:rPr>
+          <w:rFonts w:ascii="Calibri" w:hAnsi="Calibri"/>
+          <w:color w:val="1A202C"/>
+          <w:sz w:val="20"/>
+        </w:rPr>
+        <w:t>The signature pad uses an HTML5 Canvas element listening to normalized touch and mouse coordinate events. Upon completion, the canvas buffer is serialized into a PNG Base64 Data URI, which is embedded directly into the invoice data model and rendered during PDF compilation.</w:t>
+      </w:r>
+    </w:p>
+    <w:p>
+      <w:pPr>
+        <w:pStyle w:val="Heading2"/>
+        <w:spacing w:before="200" w:after="60"/>
+      </w:pPr>
+      <w:r>
+        <w:rPr>
+          <w:rFonts w:ascii="Calibri" w:hAnsi="Calibri"/>
+          <w:b/>
+          <w:color w:val="2C3E50"/>
+          <w:sz w:val="25"/>
+        </w:rPr>
+        <w:t>Conclusion &amp; Learning Outcomes</w:t>
+      </w:r>
+    </w:p>
+    <w:p>
+      <w:pPr>
+        <w:spacing w:before="0" w:after="90" w:line="276" w:lineRule="auto"/>
+      </w:pPr>
+      <w:r>
+        <w:rPr>
+          <w:rFonts w:ascii="Calibri" w:hAnsi="Calibri"/>
+          <w:color w:val="1A202C"/>
+          <w:sz w:val="21"/>
+        </w:rPr>
+        <w:t>Experiment 1 successfully established the conceptual framework, statutory requirements, and architectural boundaries for the Ledgerly Invoice Generator. The feasibility analysis proved that a pure client-side PWA delivers optimal privacy, zero operating cost, and robust offline reliability, setting a clear trajectory for subsequent development milestones.</w:t>
       </w:r>
     </w:p>
     <w:sectPr>
+      <w:headerReference w:type="default" r:id="rId9"/>
+      <w:footerReference w:type="default" r:id="rId10"/>
       <w:pgSz w:w="12240" w:h="15840"/>
-      <w:pgMar w:top="1440" w:right="1800" w:bottom="1440" w:left="1800" w:header="720" w:footer="720" w:gutter="0"/>
+      <w:pgMar w:top="1440" w:right="1440" w:bottom="1440" w:left="1440" w:header="720" w:footer="720" w:gutter="0"/>
       <w:cols w:space="720"/>
       <w:docGrid w:linePitch="360"/>
     </w:sectPr>
   </w:body>
 </w:document>
+</file>
+
+<file path=word/footer1.xml><?xml version="1.0" encoding="utf-8"?>
+<w:ftr xmlns:m="http://schemas.openxmlformats.org/officeDocument/2006/math" xmlns:mc="http://schemas.openxmlformats.org/markup-compatibility/2006" xmlns:mo="http://schemas.microsoft.com/office/mac/office/2008/main" xmlns:mv="urn:schemas-microsoft-com:mac:vml" xmlns:o="urn:schemas-microsoft-com:office:office" xmlns:r="http://schemas.openxmlformats.org/officeDocument/2006/relationships" xmlns:v="urn:schemas-microsoft-com:vml" xmlns:w10="urn:schemas-microsoft-com:office:word" xmlns:w14="http://schemas.microsoft.com/office/word/2010/wordml" xmlns:w="http://schemas.openxmlformats.org/wordprocessingml/2006/main" xmlns:wne="http://schemas.microsoft.com/office/word/2006/wordml" xmlns:wp14="http://schemas.microsoft.com/office/word/2010/wordprocessingDrawing" xmlns:wp="http://schemas.openxmlformats.org/drawingml/2006/wordprocessingDrawing" xmlns:wpc="http://schemas.microsoft.com/office/word/2010/wordprocessingCanvas" xmlns:wpg="http://schemas.microsoft.com/office/word/2010/wordprocessingGroup" xmlns:wpi="http://schemas.microsoft.com/office/word/2010/wordprocessingInk" xmlns:wps="http://schemas.microsoft.com/office/word/2010/wordprocessingShape" mc:Ignorable="w14 wp14">
+  <w:p>
+    <w:pPr>
+      <w:pStyle w:val="Footer"/>
+      <w:jc w:val="both"/>
+    </w:pPr>
+    <w:r>
+      <w:rPr>
+        <w:rFonts w:ascii="Calibri" w:hAnsi="Calibri"/>
+        <w:color w:val="718096"/>
+        <w:sz w:val="17"/>
+      </w:rPr>
+      <w:t>Project Case Study: Ledgerly PWA</w:t>
+      <w:tab/>
+      <w:tab/>
+      <w:t>Academic Year 2026-27</w:t>
+    </w:r>
+  </w:p>
+</w:ftr>
+</file>
+
+<file path=word/header1.xml><?xml version="1.0" encoding="utf-8"?>
+<w:hdr xmlns:m="http://schemas.openxmlformats.org/officeDocument/2006/math" xmlns:mc="http://schemas.openxmlformats.org/markup-compatibility/2006" xmlns:mo="http://schemas.microsoft.com/office/mac/office/2008/main" xmlns:mv="urn:schemas-microsoft-com:mac:vml" xmlns:o="urn:schemas-microsoft-com:office:office" xmlns:r="http://schemas.openxmlformats.org/officeDocument/2006/relationships" xmlns:v="urn:schemas-microsoft-com:vml" xmlns:w10="urn:schemas-microsoft-com:office:word" xmlns:w14="http://schemas.microsoft.com/office/word/2010/wordml" xmlns:w="http://schemas.openxmlformats.org/wordprocessingml/2006/main" xmlns:wne="http://schemas.microsoft.com/office/word/2006/wordml" xmlns:wp14="http://schemas.microsoft.com/office/word/2010/wordprocessingDrawing" xmlns:wp="http://schemas.openxmlformats.org/drawingml/2006/wordprocessingDrawing" xmlns:wpc="http://schemas.microsoft.com/office/word/2010/wordprocessingCanvas" xmlns:wpg="http://schemas.microsoft.com/office/word/2010/wordprocessingGroup" xmlns:wpi="http://schemas.microsoft.com/office/word/2010/wordprocessingInk" xmlns:wps="http://schemas.microsoft.com/office/word/2010/wordprocessingShape" mc:Ignorable="w14 wp14">
+  <w:p>
+    <w:pPr>
+      <w:pStyle w:val="Header"/>
+      <w:jc w:val="right"/>
+    </w:pPr>
+    <w:r>
+      <w:rPr>
+        <w:rFonts w:ascii="Calibri" w:hAnsi="Calibri"/>
+        <w:color w:val="718096"/>
+        <w:sz w:val="17"/>
+      </w:rPr>
+      <w:t>Department of Computer Engineering  |  WDL Lab (CMPN Div C)</w:t>
+    </w:r>
+  </w:p>
+</w:hdr>
 </file>
 
 <file path=word/numbering.xml><?xml version="1.0" encoding="utf-8"?>

</xml_diff>